<commit_message>
Doc:Ajustei a metodologia, terminei o desenvolvimento e ajustei as imagens
</commit_message>
<xml_diff>
--- a/Documentação/DOCUMENTO-SENAI-APEX-00.docx
+++ b/Documentação/DOCUMENTO-SENAI-APEX-00.docx
@@ -4428,7 +4428,25 @@
             <w:b/>
             <w:noProof/>
           </w:rPr>
-          <w:t xml:space="preserve">Figura 1 – </w:t>
+          <w:t>Figu</w:t>
+        </w:r>
+        <w:r>
+          <w:rPr>
+            <w:rStyle w:val="Hyperlink"/>
+            <w:rFonts w:ascii="Times New Roman" w:hAnsi="Times New Roman" w:cs="Times New Roman"/>
+            <w:b/>
+            <w:noProof/>
+          </w:rPr>
+          <w:t>r</w:t>
+        </w:r>
+        <w:r>
+          <w:rPr>
+            <w:rStyle w:val="Hyperlink"/>
+            <w:rFonts w:ascii="Times New Roman" w:hAnsi="Times New Roman" w:cs="Times New Roman"/>
+            <w:b/>
+            <w:noProof/>
+          </w:rPr>
+          <w:t xml:space="preserve">a 1 – </w:t>
         </w:r>
         <w:r>
           <w:rPr>
@@ -7761,34 +7779,127 @@
           <w:sz w:val="24"/>
           <w:szCs w:val="24"/>
         </w:rPr>
-        <w:t>A página web</w:t>
-      </w:r>
-      <w:r>
-        <w:rPr>
-          <w:rFonts w:ascii="Times New Roman" w:hAnsi="Times New Roman" w:cs="Times New Roman"/>
-          <w:bCs/>
-          <w:sz w:val="24"/>
-          <w:szCs w:val="24"/>
-        </w:rPr>
-        <w:t xml:space="preserve"> promove organização e planejamentos de </w:t>
-      </w:r>
-      <w:r>
-        <w:rPr>
-          <w:rFonts w:ascii="Times New Roman" w:hAnsi="Times New Roman" w:cs="Times New Roman"/>
-          <w:bCs/>
-          <w:sz w:val="24"/>
-          <w:szCs w:val="24"/>
-        </w:rPr>
-        <w:t>serviços de maneira automática e prática</w:t>
-      </w:r>
-      <w:r>
-        <w:rPr>
-          <w:rFonts w:ascii="Times New Roman" w:hAnsi="Times New Roman" w:cs="Times New Roman"/>
-          <w:bCs/>
-          <w:sz w:val="24"/>
-          <w:szCs w:val="24"/>
-        </w:rPr>
-        <w:t>. O</w:t>
+        <w:t>O</w:t>
+      </w:r>
+      <w:r>
+        <w:rPr>
+          <w:rFonts w:ascii="Times New Roman" w:hAnsi="Times New Roman" w:cs="Times New Roman"/>
+          <w:bCs/>
+          <w:sz w:val="24"/>
+          <w:szCs w:val="24"/>
+        </w:rPr>
+        <w:t xml:space="preserve"> nosso software promove organizações e planejamentos através de recursos tecnológicos de forma ágil através de um desenvolvimento de dashboard</w:t>
+      </w:r>
+      <w:r>
+        <w:rPr>
+          <w:rFonts w:ascii="Times New Roman" w:hAnsi="Times New Roman" w:cs="Times New Roman"/>
+          <w:bCs/>
+          <w:sz w:val="24"/>
+          <w:szCs w:val="24"/>
+        </w:rPr>
+        <w:t xml:space="preserve">. Nosso software tem como objetivo automatizar e agilizar o processo de administração na concessionária APEX, fornecendo mais agilidade </w:t>
+      </w:r>
+      <w:r>
+        <w:rPr>
+          <w:rFonts w:ascii="Times New Roman" w:hAnsi="Times New Roman" w:cs="Times New Roman"/>
+          <w:bCs/>
+          <w:sz w:val="24"/>
+          <w:szCs w:val="24"/>
+        </w:rPr>
+        <w:t>não hora de contratar funcionários, gerenciar estoque, registrar produtos e fornecedores também no pós</w:t>
+      </w:r>
+      <w:r>
+        <w:rPr>
+          <w:rFonts w:ascii="Times New Roman" w:hAnsi="Times New Roman" w:cs="Times New Roman"/>
+          <w:bCs/>
+          <w:sz w:val="24"/>
+          <w:szCs w:val="24"/>
+        </w:rPr>
+        <w:t>-</w:t>
+      </w:r>
+      <w:r>
+        <w:rPr>
+          <w:rFonts w:ascii="Times New Roman" w:hAnsi="Times New Roman" w:cs="Times New Roman"/>
+          <w:bCs/>
+          <w:sz w:val="24"/>
+          <w:szCs w:val="24"/>
+        </w:rPr>
+        <w:t>vendas.</w:t>
+      </w:r>
+    </w:p>
+    <w:p>
+      <w:pPr>
+        <w:spacing w:after="0" w:line="360" w:lineRule="auto"/>
+        <w:ind w:firstLine="709"/>
+        <w:rPr>
+          <w:rFonts w:ascii="Times New Roman" w:hAnsi="Times New Roman" w:cs="Times New Roman"/>
+          <w:bCs/>
+          <w:sz w:val="24"/>
+          <w:szCs w:val="24"/>
+        </w:rPr>
+      </w:pPr>
+      <w:r>
+        <w:rPr>
+          <w:rFonts w:ascii="Times New Roman" w:hAnsi="Times New Roman" w:cs="Times New Roman"/>
+          <w:bCs/>
+          <w:sz w:val="24"/>
+          <w:szCs w:val="24"/>
+        </w:rPr>
+        <w:t>Para o desenvolvimento d</w:t>
+      </w:r>
+      <w:r>
+        <w:rPr>
+          <w:rFonts w:ascii="Times New Roman" w:hAnsi="Times New Roman" w:cs="Times New Roman"/>
+          <w:bCs/>
+          <w:sz w:val="24"/>
+          <w:szCs w:val="24"/>
+        </w:rPr>
+        <w:t>este</w:t>
+      </w:r>
+      <w:r>
+        <w:rPr>
+          <w:rFonts w:ascii="Times New Roman" w:hAnsi="Times New Roman" w:cs="Times New Roman"/>
+          <w:bCs/>
+          <w:sz w:val="24"/>
+          <w:szCs w:val="24"/>
+        </w:rPr>
+        <w:t xml:space="preserve"> projeto foi utilizad</w:t>
+      </w:r>
+      <w:r>
+        <w:rPr>
+          <w:rFonts w:ascii="Times New Roman" w:hAnsi="Times New Roman" w:cs="Times New Roman"/>
+          <w:bCs/>
+          <w:sz w:val="24"/>
+          <w:szCs w:val="24"/>
+        </w:rPr>
+        <w:t>a</w:t>
+      </w:r>
+      <w:r>
+        <w:rPr>
+          <w:rFonts w:ascii="Times New Roman" w:hAnsi="Times New Roman" w:cs="Times New Roman"/>
+          <w:bCs/>
+          <w:sz w:val="24"/>
+          <w:szCs w:val="24"/>
+        </w:rPr>
+        <w:t xml:space="preserve"> a metodologia ágil</w:t>
+      </w:r>
+      <w:r>
+        <w:rPr>
+          <w:rFonts w:ascii="Times New Roman" w:hAnsi="Times New Roman" w:cs="Times New Roman"/>
+          <w:bCs/>
+          <w:sz w:val="24"/>
+          <w:szCs w:val="24"/>
+        </w:rPr>
+        <w:t xml:space="preserve"> Scrum</w:t>
+      </w:r>
+      <w:r>
+        <w:rPr>
+          <w:rFonts w:ascii="Times New Roman" w:hAnsi="Times New Roman" w:cs="Times New Roman"/>
+          <w:bCs/>
+          <w:sz w:val="24"/>
+          <w:szCs w:val="24"/>
+        </w:rPr>
+        <w:t>,</w:t>
       </w:r>
       <w:r>
         <w:rPr>
@@ -7806,43 +7917,110 @@
           <w:sz w:val="24"/>
           <w:szCs w:val="24"/>
         </w:rPr>
-        <w:t>software visa facilitar a organização</w:t>
-      </w:r>
-      <w:r>
-        <w:rPr>
-          <w:rFonts w:ascii="Times New Roman" w:hAnsi="Times New Roman" w:cs="Times New Roman"/>
-          <w:bCs/>
-          <w:sz w:val="24"/>
-          <w:szCs w:val="24"/>
-        </w:rPr>
-        <w:t xml:space="preserve"> e </w:t>
-      </w:r>
-      <w:r>
-        <w:rPr>
-          <w:rFonts w:ascii="Times New Roman" w:hAnsi="Times New Roman" w:cs="Times New Roman"/>
-          <w:bCs/>
-          <w:sz w:val="24"/>
-          <w:szCs w:val="24"/>
-        </w:rPr>
-        <w:t xml:space="preserve">o controle de </w:t>
-      </w:r>
-      <w:r>
-        <w:rPr>
-          <w:rFonts w:ascii="Times New Roman" w:hAnsi="Times New Roman" w:cs="Times New Roman"/>
-          <w:bCs/>
-          <w:sz w:val="24"/>
-          <w:szCs w:val="24"/>
-        </w:rPr>
-        <w:t>colaboradores e vendas</w:t>
-      </w:r>
-      <w:r>
-        <w:rPr>
-          <w:rFonts w:ascii="Times New Roman" w:hAnsi="Times New Roman" w:cs="Times New Roman"/>
-          <w:bCs/>
-          <w:sz w:val="24"/>
-          <w:szCs w:val="24"/>
-        </w:rPr>
-        <w:t>, oferecendo</w:t>
+        <w:t>permitindo a flexibilidade e a adaptação contínua ao longo do processo.</w:t>
+      </w:r>
+      <w:r>
+        <w:rPr>
+          <w:rFonts w:ascii="Times New Roman" w:hAnsi="Times New Roman" w:cs="Times New Roman"/>
+          <w:bCs/>
+          <w:sz w:val="24"/>
+          <w:szCs w:val="24"/>
+        </w:rPr>
+        <w:t xml:space="preserve"> Esta aplicação</w:t>
+      </w:r>
+      <w:r>
+        <w:rPr>
+          <w:rFonts w:ascii="Times New Roman" w:hAnsi="Times New Roman" w:cs="Times New Roman"/>
+          <w:bCs/>
+          <w:sz w:val="24"/>
+          <w:szCs w:val="24"/>
+        </w:rPr>
+        <w:t xml:space="preserve"> foi construíd</w:t>
+      </w:r>
+      <w:r>
+        <w:rPr>
+          <w:rFonts w:ascii="Times New Roman" w:hAnsi="Times New Roman" w:cs="Times New Roman"/>
+          <w:bCs/>
+          <w:sz w:val="24"/>
+          <w:szCs w:val="24"/>
+        </w:rPr>
+        <w:t>a</w:t>
+      </w:r>
+      <w:r>
+        <w:rPr>
+          <w:rFonts w:ascii="Times New Roman" w:hAnsi="Times New Roman" w:cs="Times New Roman"/>
+          <w:bCs/>
+          <w:sz w:val="24"/>
+          <w:szCs w:val="24"/>
+        </w:rPr>
+        <w:t xml:space="preserve"> utilizando o </w:t>
+      </w:r>
+      <w:proofErr w:type="spellStart"/>
+      <w:r>
+        <w:rPr>
+          <w:rFonts w:ascii="Times New Roman" w:hAnsi="Times New Roman" w:cs="Times New Roman"/>
+          <w:bCs/>
+          <w:sz w:val="24"/>
+          <w:szCs w:val="24"/>
+        </w:rPr>
+        <w:t>VSCode</w:t>
+      </w:r>
+      <w:proofErr w:type="spellEnd"/>
+      <w:r>
+        <w:rPr>
+          <w:rFonts w:ascii="Times New Roman" w:hAnsi="Times New Roman" w:cs="Times New Roman"/>
+          <w:bCs/>
+          <w:sz w:val="24"/>
+          <w:szCs w:val="24"/>
+        </w:rPr>
+        <w:t xml:space="preserve"> (Visual Studio </w:t>
+      </w:r>
+      <w:proofErr w:type="spellStart"/>
+      <w:r>
+        <w:rPr>
+          <w:rFonts w:ascii="Times New Roman" w:hAnsi="Times New Roman" w:cs="Times New Roman"/>
+          <w:bCs/>
+          <w:sz w:val="24"/>
+          <w:szCs w:val="24"/>
+        </w:rPr>
+        <w:t>Code</w:t>
+      </w:r>
+      <w:proofErr w:type="spellEnd"/>
+      <w:r>
+        <w:rPr>
+          <w:rFonts w:ascii="Times New Roman" w:hAnsi="Times New Roman" w:cs="Times New Roman"/>
+          <w:bCs/>
+          <w:sz w:val="24"/>
+          <w:szCs w:val="24"/>
+        </w:rPr>
+        <w:t>)</w:t>
+      </w:r>
+      <w:r>
+        <w:rPr>
+          <w:rFonts w:ascii="Times New Roman" w:hAnsi="Times New Roman" w:cs="Times New Roman"/>
+          <w:bCs/>
+          <w:sz w:val="24"/>
+          <w:szCs w:val="24"/>
+        </w:rPr>
+        <w:t xml:space="preserve"> e a</w:t>
+      </w:r>
+      <w:r>
+        <w:rPr>
+          <w:rFonts w:ascii="Times New Roman" w:hAnsi="Times New Roman" w:cs="Times New Roman"/>
+          <w:bCs/>
+          <w:sz w:val="24"/>
+          <w:szCs w:val="24"/>
+        </w:rPr>
+        <w:t>s</w:t>
+      </w:r>
+      <w:r>
+        <w:rPr>
+          <w:rFonts w:ascii="Times New Roman" w:hAnsi="Times New Roman" w:cs="Times New Roman"/>
+          <w:bCs/>
+          <w:sz w:val="24"/>
+          <w:szCs w:val="24"/>
+        </w:rPr>
+        <w:t xml:space="preserve"> linguagem</w:t>
       </w:r>
       <w:r>
         <w:rPr>
@@ -7860,7 +8038,52 @@
           <w:sz w:val="24"/>
           <w:szCs w:val="24"/>
         </w:rPr>
-        <w:t>uma plataforma que auxilia e facilita o processo de</w:t>
+        <w:t>HTML</w:t>
+      </w:r>
+      <w:r>
+        <w:rPr>
+          <w:rFonts w:ascii="Times New Roman" w:hAnsi="Times New Roman" w:cs="Times New Roman"/>
+          <w:bCs/>
+          <w:sz w:val="24"/>
+          <w:szCs w:val="24"/>
+        </w:rPr>
+        <w:t xml:space="preserve"> 5</w:t>
+      </w:r>
+      <w:r>
+        <w:rPr>
+          <w:rFonts w:ascii="Times New Roman" w:hAnsi="Times New Roman" w:cs="Times New Roman"/>
+          <w:bCs/>
+          <w:sz w:val="24"/>
+          <w:szCs w:val="24"/>
+        </w:rPr>
+        <w:t>, CSS</w:t>
+      </w:r>
+      <w:r>
+        <w:rPr>
+          <w:rFonts w:ascii="Times New Roman" w:hAnsi="Times New Roman" w:cs="Times New Roman"/>
+          <w:bCs/>
+          <w:sz w:val="24"/>
+          <w:szCs w:val="24"/>
+        </w:rPr>
+        <w:t>3</w:t>
+      </w:r>
+      <w:r>
+        <w:rPr>
+          <w:rFonts w:ascii="Times New Roman" w:hAnsi="Times New Roman" w:cs="Times New Roman"/>
+          <w:bCs/>
+          <w:sz w:val="24"/>
+          <w:szCs w:val="24"/>
+        </w:rPr>
+        <w:t>,</w:t>
+      </w:r>
+      <w:r>
+        <w:rPr>
+          <w:rFonts w:ascii="Times New Roman" w:hAnsi="Times New Roman" w:cs="Times New Roman"/>
+          <w:bCs/>
+          <w:sz w:val="24"/>
+          <w:szCs w:val="24"/>
+        </w:rPr>
+        <w:t xml:space="preserve"> Java script</w:t>
       </w:r>
       <w:r>
         <w:rPr>
@@ -7878,71 +8101,19 @@
           <w:sz w:val="24"/>
           <w:szCs w:val="24"/>
         </w:rPr>
-        <w:t>organização</w:t>
-      </w:r>
-      <w:r>
-        <w:rPr>
-          <w:rFonts w:ascii="Times New Roman" w:hAnsi="Times New Roman" w:cs="Times New Roman"/>
-          <w:bCs/>
-          <w:sz w:val="24"/>
-          <w:szCs w:val="24"/>
-        </w:rPr>
-        <w:t xml:space="preserve"> para o</w:t>
-      </w:r>
-      <w:r>
-        <w:rPr>
-          <w:rFonts w:ascii="Times New Roman" w:hAnsi="Times New Roman" w:cs="Times New Roman"/>
-          <w:bCs/>
-          <w:sz w:val="24"/>
-          <w:szCs w:val="24"/>
-        </w:rPr>
-        <w:t>s administradores</w:t>
-      </w:r>
-      <w:r>
-        <w:rPr>
-          <w:rFonts w:ascii="Times New Roman" w:hAnsi="Times New Roman" w:cs="Times New Roman"/>
-          <w:bCs/>
-          <w:sz w:val="24"/>
-          <w:szCs w:val="24"/>
-        </w:rPr>
-        <w:t xml:space="preserve">. Oferecendo uma gama de informações sobre </w:t>
-      </w:r>
-      <w:r>
-        <w:rPr>
-          <w:rFonts w:ascii="Times New Roman" w:hAnsi="Times New Roman" w:cs="Times New Roman"/>
-          <w:bCs/>
-          <w:sz w:val="24"/>
-          <w:szCs w:val="24"/>
-        </w:rPr>
-        <w:t>vendas</w:t>
-      </w:r>
-      <w:r>
-        <w:rPr>
-          <w:rFonts w:ascii="Times New Roman" w:hAnsi="Times New Roman" w:cs="Times New Roman"/>
-          <w:bCs/>
-          <w:sz w:val="24"/>
-          <w:szCs w:val="24"/>
-        </w:rPr>
-        <w:t xml:space="preserve">, </w:t>
-      </w:r>
-      <w:r>
-        <w:rPr>
-          <w:rFonts w:ascii="Times New Roman" w:hAnsi="Times New Roman" w:cs="Times New Roman"/>
-          <w:bCs/>
-          <w:sz w:val="24"/>
-          <w:szCs w:val="24"/>
-        </w:rPr>
-        <w:t>fornecedores</w:t>
-      </w:r>
-      <w:r>
-        <w:rPr>
-          <w:rFonts w:ascii="Times New Roman" w:hAnsi="Times New Roman" w:cs="Times New Roman"/>
-          <w:bCs/>
-          <w:sz w:val="24"/>
-          <w:szCs w:val="24"/>
-        </w:rPr>
-        <w:t>,</w:t>
-      </w:r>
+        <w:t xml:space="preserve">e </w:t>
+      </w:r>
+      <w:proofErr w:type="spellStart"/>
+      <w:r>
+        <w:rPr>
+          <w:rFonts w:ascii="Times New Roman" w:hAnsi="Times New Roman" w:cs="Times New Roman"/>
+          <w:bCs/>
+          <w:sz w:val="24"/>
+          <w:szCs w:val="24"/>
+        </w:rPr>
+        <w:t>bootstrap</w:t>
+      </w:r>
+      <w:proofErr w:type="spellEnd"/>
       <w:r>
         <w:rPr>
           <w:rFonts w:ascii="Times New Roman" w:hAnsi="Times New Roman" w:cs="Times New Roman"/>
@@ -7959,284 +8130,7 @@
           <w:sz w:val="24"/>
           <w:szCs w:val="24"/>
         </w:rPr>
-        <w:t>produtos</w:t>
-      </w:r>
-      <w:r>
-        <w:rPr>
-          <w:rFonts w:ascii="Times New Roman" w:hAnsi="Times New Roman" w:cs="Times New Roman"/>
-          <w:bCs/>
-          <w:sz w:val="24"/>
-          <w:szCs w:val="24"/>
-        </w:rPr>
-        <w:t xml:space="preserve"> e informações</w:t>
-      </w:r>
-      <w:r>
-        <w:rPr>
-          <w:rFonts w:ascii="Times New Roman" w:hAnsi="Times New Roman" w:cs="Times New Roman"/>
-          <w:bCs/>
-          <w:sz w:val="24"/>
-          <w:szCs w:val="24"/>
-        </w:rPr>
-        <w:t>.</w:t>
-      </w:r>
-    </w:p>
-    <w:p>
-      <w:pPr>
-        <w:spacing w:after="0" w:line="360" w:lineRule="auto"/>
-        <w:ind w:firstLine="709"/>
-        <w:rPr>
-          <w:rFonts w:ascii="Times New Roman" w:hAnsi="Times New Roman" w:cs="Times New Roman"/>
-          <w:bCs/>
-          <w:sz w:val="24"/>
-          <w:szCs w:val="24"/>
-        </w:rPr>
-      </w:pPr>
-      <w:r>
-        <w:rPr>
-          <w:rFonts w:ascii="Times New Roman" w:hAnsi="Times New Roman" w:cs="Times New Roman"/>
-          <w:bCs/>
-          <w:sz w:val="24"/>
-          <w:szCs w:val="24"/>
-        </w:rPr>
-        <w:t>Para o desenvolvimento d</w:t>
-      </w:r>
-      <w:r>
-        <w:rPr>
-          <w:rFonts w:ascii="Times New Roman" w:hAnsi="Times New Roman" w:cs="Times New Roman"/>
-          <w:bCs/>
-          <w:sz w:val="24"/>
-          <w:szCs w:val="24"/>
-        </w:rPr>
-        <w:t>este</w:t>
-      </w:r>
-      <w:r>
-        <w:rPr>
-          <w:rFonts w:ascii="Times New Roman" w:hAnsi="Times New Roman" w:cs="Times New Roman"/>
-          <w:bCs/>
-          <w:sz w:val="24"/>
-          <w:szCs w:val="24"/>
-        </w:rPr>
-        <w:t xml:space="preserve"> projeto foi utilizad</w:t>
-      </w:r>
-      <w:r>
-        <w:rPr>
-          <w:rFonts w:ascii="Times New Roman" w:hAnsi="Times New Roman" w:cs="Times New Roman"/>
-          <w:bCs/>
-          <w:sz w:val="24"/>
-          <w:szCs w:val="24"/>
-        </w:rPr>
-        <w:t>a</w:t>
-      </w:r>
-      <w:r>
-        <w:rPr>
-          <w:rFonts w:ascii="Times New Roman" w:hAnsi="Times New Roman" w:cs="Times New Roman"/>
-          <w:bCs/>
-          <w:sz w:val="24"/>
-          <w:szCs w:val="24"/>
-        </w:rPr>
-        <w:t xml:space="preserve"> a metodologia ágil</w:t>
-      </w:r>
-      <w:r>
-        <w:rPr>
-          <w:rFonts w:ascii="Times New Roman" w:hAnsi="Times New Roman" w:cs="Times New Roman"/>
-          <w:bCs/>
-          <w:sz w:val="24"/>
-          <w:szCs w:val="24"/>
-        </w:rPr>
-        <w:t xml:space="preserve"> Scrum</w:t>
-      </w:r>
-      <w:r>
-        <w:rPr>
-          <w:rFonts w:ascii="Times New Roman" w:hAnsi="Times New Roman" w:cs="Times New Roman"/>
-          <w:bCs/>
-          <w:sz w:val="24"/>
-          <w:szCs w:val="24"/>
-        </w:rPr>
-        <w:t>,</w:t>
-      </w:r>
-      <w:r>
-        <w:rPr>
-          <w:rFonts w:ascii="Times New Roman" w:hAnsi="Times New Roman" w:cs="Times New Roman"/>
-          <w:bCs/>
-          <w:sz w:val="24"/>
-          <w:szCs w:val="24"/>
-        </w:rPr>
-        <w:t xml:space="preserve"> </w:t>
-      </w:r>
-      <w:r>
-        <w:rPr>
-          <w:rFonts w:ascii="Times New Roman" w:hAnsi="Times New Roman" w:cs="Times New Roman"/>
-          <w:bCs/>
-          <w:sz w:val="24"/>
-          <w:szCs w:val="24"/>
-        </w:rPr>
-        <w:t>permitindo a flexibilidade e a adaptação contínua ao longo do processo.</w:t>
-      </w:r>
-      <w:r>
-        <w:rPr>
-          <w:rFonts w:ascii="Times New Roman" w:hAnsi="Times New Roman" w:cs="Times New Roman"/>
-          <w:bCs/>
-          <w:sz w:val="24"/>
-          <w:szCs w:val="24"/>
-        </w:rPr>
-        <w:t xml:space="preserve"> Esta aplicação</w:t>
-      </w:r>
-      <w:r>
-        <w:rPr>
-          <w:rFonts w:ascii="Times New Roman" w:hAnsi="Times New Roman" w:cs="Times New Roman"/>
-          <w:bCs/>
-          <w:sz w:val="24"/>
-          <w:szCs w:val="24"/>
-        </w:rPr>
-        <w:t xml:space="preserve"> foi construíd</w:t>
-      </w:r>
-      <w:r>
-        <w:rPr>
-          <w:rFonts w:ascii="Times New Roman" w:hAnsi="Times New Roman" w:cs="Times New Roman"/>
-          <w:bCs/>
-          <w:sz w:val="24"/>
-          <w:szCs w:val="24"/>
-        </w:rPr>
-        <w:t>a</w:t>
-      </w:r>
-      <w:r>
-        <w:rPr>
-          <w:rFonts w:ascii="Times New Roman" w:hAnsi="Times New Roman" w:cs="Times New Roman"/>
-          <w:bCs/>
-          <w:sz w:val="24"/>
-          <w:szCs w:val="24"/>
-        </w:rPr>
-        <w:t xml:space="preserve"> utilizando o </w:t>
-      </w:r>
-      <w:proofErr w:type="spellStart"/>
-      <w:r>
-        <w:rPr>
-          <w:rFonts w:ascii="Times New Roman" w:hAnsi="Times New Roman" w:cs="Times New Roman"/>
-          <w:bCs/>
-          <w:sz w:val="24"/>
-          <w:szCs w:val="24"/>
-        </w:rPr>
-        <w:t>VSCode</w:t>
-      </w:r>
-      <w:proofErr w:type="spellEnd"/>
-      <w:r>
-        <w:rPr>
-          <w:rFonts w:ascii="Times New Roman" w:hAnsi="Times New Roman" w:cs="Times New Roman"/>
-          <w:bCs/>
-          <w:sz w:val="24"/>
-          <w:szCs w:val="24"/>
-        </w:rPr>
-        <w:t xml:space="preserve"> (Visual Studio </w:t>
-      </w:r>
-      <w:proofErr w:type="spellStart"/>
-      <w:r>
-        <w:rPr>
-          <w:rFonts w:ascii="Times New Roman" w:hAnsi="Times New Roman" w:cs="Times New Roman"/>
-          <w:bCs/>
-          <w:sz w:val="24"/>
-          <w:szCs w:val="24"/>
-        </w:rPr>
-        <w:t>Code</w:t>
-      </w:r>
-      <w:proofErr w:type="spellEnd"/>
-      <w:r>
-        <w:rPr>
-          <w:rFonts w:ascii="Times New Roman" w:hAnsi="Times New Roman" w:cs="Times New Roman"/>
-          <w:bCs/>
-          <w:sz w:val="24"/>
-          <w:szCs w:val="24"/>
-        </w:rPr>
-        <w:t>)</w:t>
-      </w:r>
-      <w:r>
-        <w:rPr>
-          <w:rFonts w:ascii="Times New Roman" w:hAnsi="Times New Roman" w:cs="Times New Roman"/>
-          <w:bCs/>
-          <w:sz w:val="24"/>
-          <w:szCs w:val="24"/>
-        </w:rPr>
-        <w:t xml:space="preserve"> e a</w:t>
-      </w:r>
-      <w:r>
-        <w:rPr>
-          <w:rFonts w:ascii="Times New Roman" w:hAnsi="Times New Roman" w:cs="Times New Roman"/>
-          <w:bCs/>
-          <w:sz w:val="24"/>
-          <w:szCs w:val="24"/>
-        </w:rPr>
-        <w:t>s</w:t>
-      </w:r>
-      <w:r>
-        <w:rPr>
-          <w:rFonts w:ascii="Times New Roman" w:hAnsi="Times New Roman" w:cs="Times New Roman"/>
-          <w:bCs/>
-          <w:sz w:val="24"/>
-          <w:szCs w:val="24"/>
-        </w:rPr>
-        <w:t xml:space="preserve"> linguagem</w:t>
-      </w:r>
-      <w:r>
-        <w:rPr>
-          <w:rFonts w:ascii="Times New Roman" w:hAnsi="Times New Roman" w:cs="Times New Roman"/>
-          <w:bCs/>
-          <w:sz w:val="24"/>
-          <w:szCs w:val="24"/>
-        </w:rPr>
-        <w:t xml:space="preserve"> </w:t>
-      </w:r>
-      <w:r>
-        <w:rPr>
-          <w:rFonts w:ascii="Times New Roman" w:hAnsi="Times New Roman" w:cs="Times New Roman"/>
-          <w:bCs/>
-          <w:sz w:val="24"/>
-          <w:szCs w:val="24"/>
-        </w:rPr>
-        <w:t>HTML</w:t>
-      </w:r>
-      <w:r>
-        <w:rPr>
-          <w:rFonts w:ascii="Times New Roman" w:hAnsi="Times New Roman" w:cs="Times New Roman"/>
-          <w:bCs/>
-          <w:sz w:val="24"/>
-          <w:szCs w:val="24"/>
-        </w:rPr>
-        <w:t xml:space="preserve"> 5</w:t>
-      </w:r>
-      <w:r>
-        <w:rPr>
-          <w:rFonts w:ascii="Times New Roman" w:hAnsi="Times New Roman" w:cs="Times New Roman"/>
-          <w:bCs/>
-          <w:sz w:val="24"/>
-          <w:szCs w:val="24"/>
-        </w:rPr>
-        <w:t>, CSS</w:t>
-      </w:r>
-      <w:r>
-        <w:rPr>
-          <w:rFonts w:ascii="Times New Roman" w:hAnsi="Times New Roman" w:cs="Times New Roman"/>
-          <w:bCs/>
-          <w:sz w:val="24"/>
-          <w:szCs w:val="24"/>
-        </w:rPr>
-        <w:t>3</w:t>
-      </w:r>
-      <w:r>
-        <w:rPr>
-          <w:rFonts w:ascii="Times New Roman" w:hAnsi="Times New Roman" w:cs="Times New Roman"/>
-          <w:bCs/>
-          <w:sz w:val="24"/>
-          <w:szCs w:val="24"/>
-        </w:rPr>
-        <w:t xml:space="preserve"> e Java script</w:t>
-      </w:r>
-      <w:r>
-        <w:rPr>
-          <w:rFonts w:ascii="Times New Roman" w:hAnsi="Times New Roman" w:cs="Times New Roman"/>
-          <w:bCs/>
-          <w:sz w:val="24"/>
-          <w:szCs w:val="24"/>
-        </w:rPr>
-        <w:t xml:space="preserve"> para a criação gráficas das tela</w:t>
+        <w:t>para a criação gráficas das tela</w:t>
       </w:r>
       <w:r>
         <w:rPr>
@@ -8394,7 +8288,16 @@
           <w:sz w:val="24"/>
           <w:szCs w:val="24"/>
         </w:rPr>
-        <w:t>site desenvolvido</w:t>
+        <w:t>software</w:t>
+      </w:r>
+      <w:r>
+        <w:rPr>
+          <w:rFonts w:ascii="Times New Roman" w:hAnsi="Times New Roman" w:cs="Times New Roman"/>
+          <w:bCs/>
+          <w:sz w:val="24"/>
+          <w:szCs w:val="24"/>
+        </w:rPr>
+        <w:t xml:space="preserve"> desenvolvido</w:t>
       </w:r>
       <w:r>
         <w:rPr>
@@ -9710,19 +9613,11 @@
         <w:spacing w:after="0" w:line="360" w:lineRule="auto"/>
       </w:pPr>
       <w:r>
-        <w:rPr>
-          <w:rFonts w:ascii="Times New Roman" w:hAnsi="Times New Roman" w:cs="Times New Roman"/>
-          <w:b/>
-          <w:bCs/>
-          <w:noProof/>
-          <w:sz w:val="24"/>
-          <w:szCs w:val="24"/>
-        </w:rPr>
         <w:drawing>
-          <wp:inline distT="0" distB="0" distL="0" distR="0" wp14:anchorId="19ABD3EA" wp14:editId="7ED942E4">
-            <wp:extent cx="5760085" cy="3029585"/>
+          <wp:inline distT="0" distB="0" distL="0" distR="0" wp14:anchorId="7B8A9699" wp14:editId="16CF5075">
+            <wp:extent cx="5760085" cy="3109595"/>
             <wp:effectExtent l="0" t="0" r="0" b="0"/>
-            <wp:docPr id="480799191" name="Imagem 1" descr="Tela de computador&#10;&#10;O conteúdo gerado por IA pode estar incorreto."/>
+            <wp:docPr id="7" name="Imagem 7"/>
             <wp:cNvGraphicFramePr>
               <a:graphicFrameLocks xmlns:a="http://schemas.openxmlformats.org/drawingml/2006/main" noChangeAspect="1"/>
             </wp:cNvGraphicFramePr>
@@ -9730,17 +9625,11 @@
               <a:graphicData uri="http://schemas.openxmlformats.org/drawingml/2006/picture">
                 <pic:pic xmlns:pic="http://schemas.openxmlformats.org/drawingml/2006/picture">
                   <pic:nvPicPr>
-                    <pic:cNvPr id="480799191" name="Imagem 1" descr="Tela de computador&#10;&#10;O conteúdo gerado por IA pode estar incorreto."/>
+                    <pic:cNvPr id="1" name=""/>
                     <pic:cNvPicPr/>
                   </pic:nvPicPr>
                   <pic:blipFill>
-                    <a:blip r:embed="rId15">
-                      <a:extLst>
-                        <a:ext uri="{28A0092B-C50C-407E-A947-70E740481C1C}">
-                          <a14:useLocalDpi xmlns:a14="http://schemas.microsoft.com/office/drawing/2010/main" val="0"/>
-                        </a:ext>
-                      </a:extLst>
-                    </a:blip>
+                    <a:blip r:embed="rId15"/>
                     <a:stretch>
                       <a:fillRect/>
                     </a:stretch>
@@ -9748,7 +9637,7 @@
                   <pic:spPr>
                     <a:xfrm>
                       <a:off x="0" y="0"/>
-                      <a:ext cx="5760085" cy="3029585"/>
+                      <a:ext cx="5760085" cy="3109595"/>
                     </a:xfrm>
                     <a:prstGeom prst="rect">
                       <a:avLst/>
@@ -9845,7 +9734,6 @@
           <w:sz w:val="24"/>
           <w:szCs w:val="24"/>
         </w:rPr>
-        <w:lastRenderedPageBreak/>
         <w:t>4.2 HTML</w:t>
       </w:r>
       <w:bookmarkEnd w:id="15"/>
@@ -10174,6 +10062,8 @@
         </w:rPr>
       </w:pPr>
       <w:bookmarkStart w:id="17" w:name="_Toc215495516"/>
+      <w:bookmarkStart w:id="18" w:name="_GoBack"/>
+      <w:bookmarkEnd w:id="18"/>
       <w:r>
         <w:rPr>
           <w:rFonts w:ascii="Times New Roman" w:hAnsi="Times New Roman" w:cs="Times New Roman"/>
@@ -10183,6 +10073,7 @@
           <w:sz w:val="24"/>
           <w:szCs w:val="24"/>
         </w:rPr>
+        <w:lastRenderedPageBreak/>
         <w:t xml:space="preserve">Figura </w:t>
       </w:r>
       <w:r>
@@ -10276,15 +10167,14 @@
       <w:r>
         <w:rPr>
           <w:rFonts w:ascii="Times New Roman" w:hAnsi="Times New Roman" w:cs="Times New Roman"/>
-          <w:noProof/>
           <w:sz w:val="24"/>
           <w:szCs w:val="24"/>
         </w:rPr>
         <w:drawing>
-          <wp:inline distT="0" distB="0" distL="0" distR="0" wp14:anchorId="1E47E1B2" wp14:editId="6D4BCDFB">
-            <wp:extent cx="5760085" cy="3964305"/>
+          <wp:inline distT="0" distB="0" distL="0" distR="0" wp14:anchorId="0FE9797C" wp14:editId="1B079A5A">
+            <wp:extent cx="5760085" cy="4483735"/>
             <wp:effectExtent l="0" t="0" r="0" b="0"/>
-            <wp:docPr id="1318327336" name="Imagem 2" descr="Texto&#10;&#10;O conteúdo gerado por IA pode estar incorreto."/>
+            <wp:docPr id="8" name="Imagem 8"/>
             <wp:cNvGraphicFramePr>
               <a:graphicFrameLocks xmlns:a="http://schemas.openxmlformats.org/drawingml/2006/main" noChangeAspect="1"/>
             </wp:cNvGraphicFramePr>
@@ -10292,17 +10182,11 @@
               <a:graphicData uri="http://schemas.openxmlformats.org/drawingml/2006/picture">
                 <pic:pic xmlns:pic="http://schemas.openxmlformats.org/drawingml/2006/picture">
                   <pic:nvPicPr>
-                    <pic:cNvPr id="1318327336" name="Imagem 2" descr="Texto&#10;&#10;O conteúdo gerado por IA pode estar incorreto."/>
+                    <pic:cNvPr id="1" name=""/>
                     <pic:cNvPicPr/>
                   </pic:nvPicPr>
                   <pic:blipFill>
-                    <a:blip r:embed="rId16">
-                      <a:extLst>
-                        <a:ext uri="{28A0092B-C50C-407E-A947-70E740481C1C}">
-                          <a14:useLocalDpi xmlns:a14="http://schemas.microsoft.com/office/drawing/2010/main" val="0"/>
-                        </a:ext>
-                      </a:extLst>
-                    </a:blip>
+                    <a:blip r:embed="rId16"/>
                     <a:stretch>
                       <a:fillRect/>
                     </a:stretch>
@@ -10310,7 +10194,7 @@
                   <pic:spPr>
                     <a:xfrm>
                       <a:off x="0" y="0"/>
-                      <a:ext cx="5760085" cy="3964305"/>
+                      <a:ext cx="5760085" cy="4483735"/>
                     </a:xfrm>
                     <a:prstGeom prst="rect">
                       <a:avLst/>
@@ -10357,21 +10241,20 @@
           <w:szCs w:val="24"/>
         </w:rPr>
       </w:pPr>
-      <w:bookmarkStart w:id="18" w:name="_Toc213056289"/>
-      <w:bookmarkStart w:id="19" w:name="_Toc221864887"/>
-      <w:r>
-        <w:rPr>
-          <w:rFonts w:ascii="Times New Roman" w:hAnsi="Times New Roman" w:cs="Times New Roman"/>
-          <w:b/>
-          <w:bCs/>
-          <w:sz w:val="24"/>
-          <w:szCs w:val="24"/>
-        </w:rPr>
-        <w:lastRenderedPageBreak/>
+      <w:bookmarkStart w:id="19" w:name="_Toc213056289"/>
+      <w:bookmarkStart w:id="20" w:name="_Toc221864887"/>
+      <w:r>
+        <w:rPr>
+          <w:rFonts w:ascii="Times New Roman" w:hAnsi="Times New Roman" w:cs="Times New Roman"/>
+          <w:b/>
+          <w:bCs/>
+          <w:sz w:val="24"/>
+          <w:szCs w:val="24"/>
+        </w:rPr>
         <w:t>4.3 CSS</w:t>
       </w:r>
-      <w:bookmarkEnd w:id="18"/>
       <w:bookmarkEnd w:id="19"/>
+      <w:bookmarkEnd w:id="20"/>
     </w:p>
     <w:p>
       <w:pPr>
@@ -10525,7 +10408,7 @@
           <w:szCs w:val="24"/>
         </w:rPr>
       </w:pPr>
-      <w:bookmarkStart w:id="20" w:name="_Toc215495517"/>
+      <w:bookmarkStart w:id="21" w:name="_Toc215495517"/>
       <w:r>
         <w:rPr>
           <w:rFonts w:ascii="Times New Roman" w:hAnsi="Times New Roman" w:cs="Times New Roman"/>
@@ -10535,6 +10418,7 @@
           <w:sz w:val="24"/>
           <w:szCs w:val="24"/>
         </w:rPr>
+        <w:lastRenderedPageBreak/>
         <w:t xml:space="preserve">Figura </w:t>
       </w:r>
       <w:r>
@@ -10603,29 +10487,28 @@
         </w:rPr>
         <w:t xml:space="preserve"> - CSS</w:t>
       </w:r>
-      <w:bookmarkEnd w:id="20"/>
-    </w:p>
-    <w:p>
-      <w:pPr>
-        <w:spacing w:after="0" w:line="360" w:lineRule="auto"/>
-        <w:rPr>
-          <w:rFonts w:ascii="Times New Roman" w:hAnsi="Times New Roman" w:cs="Times New Roman"/>
-          <w:sz w:val="24"/>
-          <w:szCs w:val="24"/>
-        </w:rPr>
-      </w:pPr>
-      <w:r>
-        <w:rPr>
-          <w:rFonts w:ascii="Times New Roman" w:hAnsi="Times New Roman" w:cs="Times New Roman"/>
-          <w:noProof/>
+      <w:bookmarkEnd w:id="21"/>
+    </w:p>
+    <w:p>
+      <w:pPr>
+        <w:spacing w:after="0" w:line="360" w:lineRule="auto"/>
+        <w:rPr>
+          <w:rFonts w:ascii="Times New Roman" w:hAnsi="Times New Roman" w:cs="Times New Roman"/>
+          <w:sz w:val="24"/>
+          <w:szCs w:val="24"/>
+        </w:rPr>
+      </w:pPr>
+      <w:r>
+        <w:rPr>
+          <w:rFonts w:ascii="Times New Roman" w:hAnsi="Times New Roman" w:cs="Times New Roman"/>
           <w:sz w:val="24"/>
           <w:szCs w:val="24"/>
         </w:rPr>
         <w:drawing>
-          <wp:inline distT="0" distB="0" distL="0" distR="0" wp14:anchorId="5D251A94" wp14:editId="3FE14226">
-            <wp:extent cx="5760085" cy="3587115"/>
-            <wp:effectExtent l="0" t="0" r="0" b="0"/>
-            <wp:docPr id="677871529" name="Imagem 3" descr="Texto&#10;&#10;O conteúdo gerado por IA pode estar incorreto."/>
+          <wp:inline distT="0" distB="0" distL="0" distR="0" wp14:anchorId="53A2DD88" wp14:editId="17DBD9D4">
+            <wp:extent cx="5760085" cy="5800725"/>
+            <wp:effectExtent l="0" t="0" r="0" b="9525"/>
+            <wp:docPr id="9" name="Imagem 9"/>
             <wp:cNvGraphicFramePr>
               <a:graphicFrameLocks xmlns:a="http://schemas.openxmlformats.org/drawingml/2006/main" noChangeAspect="1"/>
             </wp:cNvGraphicFramePr>
@@ -10633,17 +10516,11 @@
               <a:graphicData uri="http://schemas.openxmlformats.org/drawingml/2006/picture">
                 <pic:pic xmlns:pic="http://schemas.openxmlformats.org/drawingml/2006/picture">
                   <pic:nvPicPr>
-                    <pic:cNvPr id="677871529" name="Imagem 3" descr="Texto&#10;&#10;O conteúdo gerado por IA pode estar incorreto."/>
+                    <pic:cNvPr id="1" name=""/>
                     <pic:cNvPicPr/>
                   </pic:nvPicPr>
                   <pic:blipFill>
-                    <a:blip r:embed="rId17">
-                      <a:extLst>
-                        <a:ext uri="{28A0092B-C50C-407E-A947-70E740481C1C}">
-                          <a14:useLocalDpi xmlns:a14="http://schemas.microsoft.com/office/drawing/2010/main" val="0"/>
-                        </a:ext>
-                      </a:extLst>
-                    </a:blip>
+                    <a:blip r:embed="rId17"/>
                     <a:stretch>
                       <a:fillRect/>
                     </a:stretch>
@@ -10651,7 +10528,7 @@
                   <pic:spPr>
                     <a:xfrm>
                       <a:off x="0" y="0"/>
-                      <a:ext cx="5760085" cy="3587115"/>
+                      <a:ext cx="5760085" cy="5800725"/>
                     </a:xfrm>
                     <a:prstGeom prst="rect">
                       <a:avLst/>
@@ -10762,8 +10639,21 @@
           <w:szCs w:val="24"/>
         </w:rPr>
       </w:pPr>
-      <w:bookmarkStart w:id="21" w:name="_Toc213056290"/>
-      <w:bookmarkStart w:id="22" w:name="_Toc221864888"/>
+      <w:bookmarkStart w:id="22" w:name="_Toc213056290"/>
+      <w:bookmarkStart w:id="23" w:name="_Toc221864888"/>
+    </w:p>
+    <w:p>
+      <w:pPr>
+        <w:spacing w:after="0" w:line="360" w:lineRule="auto"/>
+        <w:outlineLvl w:val="1"/>
+        <w:rPr>
+          <w:rFonts w:ascii="Times New Roman" w:hAnsi="Times New Roman" w:cs="Times New Roman"/>
+          <w:b/>
+          <w:bCs/>
+          <w:sz w:val="24"/>
+          <w:szCs w:val="24"/>
+        </w:rPr>
+      </w:pPr>
       <w:r>
         <w:rPr>
           <w:rFonts w:ascii="Times New Roman" w:hAnsi="Times New Roman" w:cs="Times New Roman"/>
@@ -10786,8 +10676,8 @@
         </w:rPr>
         <w:t>JavaScript</w:t>
       </w:r>
-      <w:bookmarkEnd w:id="21"/>
       <w:bookmarkEnd w:id="22"/>
+      <w:bookmarkEnd w:id="23"/>
       <w:proofErr w:type="spellEnd"/>
     </w:p>
     <w:p>
@@ -11046,7 +10936,7 @@
           <w:szCs w:val="24"/>
         </w:rPr>
       </w:pPr>
-      <w:bookmarkStart w:id="23" w:name="_Toc215495518"/>
+      <w:bookmarkStart w:id="24" w:name="_Toc215495518"/>
       <w:r>
         <w:rPr>
           <w:rFonts w:ascii="Times New Roman" w:hAnsi="Times New Roman" w:cs="Times New Roman"/>
@@ -11135,34 +11025,33 @@
         </w:rPr>
         <w:t>JavaScript</w:t>
       </w:r>
-      <w:bookmarkEnd w:id="23"/>
-      <w:proofErr w:type="spellEnd"/>
-    </w:p>
-    <w:p>
-      <w:pPr>
-        <w:spacing w:after="0" w:line="360" w:lineRule="auto"/>
-        <w:rPr>
-          <w:rFonts w:ascii="Times New Roman" w:hAnsi="Times New Roman" w:cs="Times New Roman"/>
-          <w:b/>
-          <w:bCs/>
-          <w:sz w:val="24"/>
-          <w:szCs w:val="24"/>
-        </w:rPr>
-      </w:pPr>
-      <w:r>
-        <w:rPr>
-          <w:rFonts w:ascii="Times New Roman" w:hAnsi="Times New Roman" w:cs="Times New Roman"/>
-          <w:b/>
-          <w:bCs/>
-          <w:noProof/>
+      <w:bookmarkEnd w:id="24"/>
+      <w:proofErr w:type="spellEnd"/>
+    </w:p>
+    <w:p>
+      <w:pPr>
+        <w:spacing w:after="0" w:line="360" w:lineRule="auto"/>
+        <w:rPr>
+          <w:rFonts w:ascii="Times New Roman" w:hAnsi="Times New Roman" w:cs="Times New Roman"/>
+          <w:b/>
+          <w:bCs/>
+          <w:sz w:val="24"/>
+          <w:szCs w:val="24"/>
+        </w:rPr>
+      </w:pPr>
+      <w:r>
+        <w:rPr>
+          <w:rFonts w:ascii="Times New Roman" w:hAnsi="Times New Roman" w:cs="Times New Roman"/>
+          <w:b/>
+          <w:bCs/>
           <w:sz w:val="24"/>
           <w:szCs w:val="24"/>
         </w:rPr>
         <w:drawing>
-          <wp:inline distT="0" distB="0" distL="0" distR="0" wp14:anchorId="6456AD5C" wp14:editId="6C45912A">
-            <wp:extent cx="5760085" cy="3345180"/>
-            <wp:effectExtent l="0" t="0" r="0" b="7620"/>
-            <wp:docPr id="2089628074" name="Imagem 5" descr="Texto&#10;&#10;O conteúdo gerado por IA pode estar incorreto."/>
+          <wp:inline distT="0" distB="0" distL="0" distR="0" wp14:anchorId="4D9D1AD7" wp14:editId="21238165">
+            <wp:extent cx="5760085" cy="4770755"/>
+            <wp:effectExtent l="0" t="0" r="0" b="0"/>
+            <wp:docPr id="10" name="Imagem 10"/>
             <wp:cNvGraphicFramePr>
               <a:graphicFrameLocks xmlns:a="http://schemas.openxmlformats.org/drawingml/2006/main" noChangeAspect="1"/>
             </wp:cNvGraphicFramePr>
@@ -11170,17 +11059,11 @@
               <a:graphicData uri="http://schemas.openxmlformats.org/drawingml/2006/picture">
                 <pic:pic xmlns:pic="http://schemas.openxmlformats.org/drawingml/2006/picture">
                   <pic:nvPicPr>
-                    <pic:cNvPr id="2089628074" name="Imagem 5" descr="Texto&#10;&#10;O conteúdo gerado por IA pode estar incorreto."/>
+                    <pic:cNvPr id="1" name=""/>
                     <pic:cNvPicPr/>
                   </pic:nvPicPr>
                   <pic:blipFill>
-                    <a:blip r:embed="rId18">
-                      <a:extLst>
-                        <a:ext uri="{28A0092B-C50C-407E-A947-70E740481C1C}">
-                          <a14:useLocalDpi xmlns:a14="http://schemas.microsoft.com/office/drawing/2010/main" val="0"/>
-                        </a:ext>
-                      </a:extLst>
-                    </a:blip>
+                    <a:blip r:embed="rId18"/>
                     <a:stretch>
                       <a:fillRect/>
                     </a:stretch>
@@ -11188,7 +11071,7 @@
                   <pic:spPr>
                     <a:xfrm>
                       <a:off x="0" y="0"/>
-                      <a:ext cx="5760085" cy="3345180"/>
+                      <a:ext cx="5760085" cy="4770755"/>
                     </a:xfrm>
                     <a:prstGeom prst="rect">
                       <a:avLst/>
@@ -11326,17 +11209,16 @@
           <w:szCs w:val="24"/>
         </w:rPr>
       </w:pPr>
-      <w:bookmarkStart w:id="24" w:name="_Toc213056291"/>
-      <w:bookmarkStart w:id="25" w:name="_Toc221864889"/>
-      <w:r>
-        <w:rPr>
-          <w:rFonts w:ascii="Times New Roman" w:hAnsi="Times New Roman" w:cs="Times New Roman"/>
-          <w:b/>
-          <w:bCs/>
-          <w:sz w:val="24"/>
-          <w:szCs w:val="24"/>
-        </w:rPr>
-        <w:lastRenderedPageBreak/>
+      <w:bookmarkStart w:id="25" w:name="_Toc213056291"/>
+      <w:bookmarkStart w:id="26" w:name="_Toc221864889"/>
+      <w:r>
+        <w:rPr>
+          <w:rFonts w:ascii="Times New Roman" w:hAnsi="Times New Roman" w:cs="Times New Roman"/>
+          <w:b/>
+          <w:bCs/>
+          <w:sz w:val="24"/>
+          <w:szCs w:val="24"/>
+        </w:rPr>
         <w:t>4.</w:t>
       </w:r>
       <w:r>
@@ -11370,8 +11252,8 @@
         </w:rPr>
         <w:t>Figma</w:t>
       </w:r>
-      <w:bookmarkEnd w:id="24"/>
       <w:bookmarkEnd w:id="25"/>
+      <w:bookmarkEnd w:id="26"/>
       <w:proofErr w:type="spellEnd"/>
     </w:p>
     <w:p>
@@ -11584,7 +11466,7 @@
           <w:szCs w:val="24"/>
         </w:rPr>
       </w:pPr>
-      <w:bookmarkStart w:id="26" w:name="_Toc215495519"/>
+      <w:bookmarkStart w:id="27" w:name="_Toc215495519"/>
       <w:r>
         <w:rPr>
           <w:rFonts w:ascii="Times New Roman" w:hAnsi="Times New Roman" w:cs="Times New Roman"/>
@@ -11594,6 +11476,7 @@
           <w:sz w:val="24"/>
           <w:szCs w:val="24"/>
         </w:rPr>
+        <w:lastRenderedPageBreak/>
         <w:t xml:space="preserve">Figura </w:t>
       </w:r>
       <w:r>
@@ -11673,7 +11556,7 @@
         </w:rPr>
         <w:t>Figma</w:t>
       </w:r>
-      <w:bookmarkEnd w:id="26"/>
+      <w:bookmarkEnd w:id="27"/>
       <w:proofErr w:type="spellEnd"/>
     </w:p>
     <w:p>
@@ -11849,8 +11732,8 @@
           <w:szCs w:val="24"/>
         </w:rPr>
       </w:pPr>
-      <w:bookmarkStart w:id="27" w:name="_Toc213056292"/>
-      <w:bookmarkStart w:id="28" w:name="_Toc221864890"/>
+      <w:bookmarkStart w:id="28" w:name="_Toc213056292"/>
+      <w:bookmarkStart w:id="29" w:name="_Toc221864890"/>
       <w:r>
         <w:rPr>
           <w:rFonts w:ascii="Times New Roman" w:hAnsi="Times New Roman" w:cs="Times New Roman"/>
@@ -11945,8 +11828,8 @@
         </w:rPr>
         <w:t>GitHub</w:t>
       </w:r>
-      <w:bookmarkEnd w:id="27"/>
       <w:bookmarkEnd w:id="28"/>
+      <w:bookmarkEnd w:id="29"/>
     </w:p>
     <w:p>
       <w:pPr>
@@ -12037,6 +11920,7 @@
           <w:sz w:val="24"/>
           <w:szCs w:val="24"/>
         </w:rPr>
+        <w:lastRenderedPageBreak/>
         <w:t xml:space="preserve">De acordo com </w:t>
       </w:r>
       <w:proofErr w:type="spellStart"/>
@@ -12292,7 +12176,7 @@
           <w:szCs w:val="24"/>
         </w:rPr>
       </w:pPr>
-      <w:bookmarkStart w:id="29" w:name="_Toc215495520"/>
+      <w:bookmarkStart w:id="30" w:name="_Toc215495520"/>
       <w:r>
         <w:rPr>
           <w:rFonts w:ascii="Times New Roman" w:hAnsi="Times New Roman" w:cs="Times New Roman"/>
@@ -12403,7 +12287,7 @@
         </w:rPr>
         <w:t>Bash</w:t>
       </w:r>
-      <w:bookmarkEnd w:id="29"/>
+      <w:bookmarkEnd w:id="30"/>
       <w:proofErr w:type="spellEnd"/>
     </w:p>
     <w:p>
@@ -12493,7 +12377,7 @@
           <w:szCs w:val="24"/>
         </w:rPr>
       </w:pPr>
-      <w:bookmarkStart w:id="30" w:name="_Toc215495521"/>
+      <w:bookmarkStart w:id="31" w:name="_Toc215495521"/>
       <w:r>
         <w:rPr>
           <w:rFonts w:ascii="Times New Roman" w:hAnsi="Times New Roman" w:cs="Times New Roman"/>
@@ -12572,7 +12456,7 @@
         </w:rPr>
         <w:t xml:space="preserve"> - GitHub</w:t>
       </w:r>
-      <w:bookmarkEnd w:id="30"/>
+      <w:bookmarkEnd w:id="31"/>
     </w:p>
     <w:p>
       <w:pPr>
@@ -12661,8 +12545,8 @@
           <w:szCs w:val="24"/>
         </w:rPr>
       </w:pPr>
-      <w:bookmarkStart w:id="31" w:name="_Toc213056293"/>
-      <w:bookmarkStart w:id="32" w:name="_Toc221864891"/>
+      <w:bookmarkStart w:id="32" w:name="_Toc213056293"/>
+      <w:bookmarkStart w:id="33" w:name="_Toc221864891"/>
       <w:r>
         <w:rPr>
           <w:rFonts w:ascii="Times New Roman" w:hAnsi="Times New Roman" w:cs="Times New Roman"/>
@@ -12704,8 +12588,8 @@
         </w:rPr>
         <w:t>Trello</w:t>
       </w:r>
-      <w:bookmarkEnd w:id="31"/>
       <w:bookmarkEnd w:id="32"/>
+      <w:bookmarkEnd w:id="33"/>
       <w:proofErr w:type="spellEnd"/>
     </w:p>
     <w:p>
@@ -12874,7 +12758,7 @@
           <w:szCs w:val="24"/>
         </w:rPr>
       </w:pPr>
-      <w:bookmarkStart w:id="33" w:name="_Toc215495522"/>
+      <w:bookmarkStart w:id="34" w:name="_Toc215495522"/>
       <w:r>
         <w:rPr>
           <w:rFonts w:ascii="Times New Roman" w:hAnsi="Times New Roman" w:cs="Times New Roman"/>
@@ -12963,7 +12847,7 @@
         </w:rPr>
         <w:t>Trello</w:t>
       </w:r>
-      <w:bookmarkEnd w:id="33"/>
+      <w:bookmarkEnd w:id="34"/>
       <w:proofErr w:type="spellEnd"/>
     </w:p>
     <w:p>
@@ -13057,8 +12941,8 @@
           <w:szCs w:val="24"/>
         </w:rPr>
       </w:pPr>
-      <w:bookmarkStart w:id="34" w:name="_Toc213056294"/>
-      <w:bookmarkStart w:id="35" w:name="_Toc221864892"/>
+      <w:bookmarkStart w:id="35" w:name="_Toc213056294"/>
+      <w:bookmarkStart w:id="36" w:name="_Toc221864892"/>
       <w:r>
         <w:rPr>
           <w:rFonts w:ascii="Times New Roman" w:hAnsi="Times New Roman" w:cs="Times New Roman"/>
@@ -13090,8 +12974,8 @@
         </w:rPr>
         <w:t xml:space="preserve"> Scrum</w:t>
       </w:r>
-      <w:bookmarkEnd w:id="34"/>
       <w:bookmarkEnd w:id="35"/>
+      <w:bookmarkEnd w:id="36"/>
     </w:p>
     <w:p>
       <w:pPr>
@@ -13203,7 +13087,7 @@
           <w:szCs w:val="24"/>
         </w:rPr>
       </w:pPr>
-      <w:bookmarkStart w:id="36" w:name="_Toc221864893"/>
+      <w:bookmarkStart w:id="37" w:name="_Toc221864893"/>
       <w:r>
         <w:rPr>
           <w:rFonts w:ascii="Times New Roman" w:hAnsi="Times New Roman" w:cs="Times New Roman"/>
@@ -13234,7 +13118,7 @@
         </w:rPr>
         <w:t>SQL</w:t>
       </w:r>
-      <w:bookmarkEnd w:id="36"/>
+      <w:bookmarkEnd w:id="37"/>
     </w:p>
     <w:p>
       <w:pPr>
@@ -13482,8 +13366,8 @@
           <w:szCs w:val="24"/>
         </w:rPr>
       </w:pPr>
-      <w:bookmarkStart w:id="37" w:name="_Toc213056295"/>
-      <w:bookmarkStart w:id="38" w:name="_Toc221864894"/>
+      <w:bookmarkStart w:id="38" w:name="_Toc213056295"/>
+      <w:bookmarkStart w:id="39" w:name="_Toc221864894"/>
       <w:r>
         <w:rPr>
           <w:rFonts w:ascii="Times New Roman" w:hAnsi="Times New Roman" w:cs="Times New Roman"/>
@@ -13536,8 +13420,8 @@
         </w:rPr>
         <w:t>MyAdmin</w:t>
       </w:r>
-      <w:bookmarkEnd w:id="37"/>
       <w:bookmarkEnd w:id="38"/>
+      <w:bookmarkEnd w:id="39"/>
       <w:proofErr w:type="spellEnd"/>
     </w:p>
     <w:p>
@@ -13734,8 +13618,6 @@
         </w:rPr>
         <w:t>Apex</w:t>
       </w:r>
-      <w:bookmarkStart w:id="39" w:name="_GoBack"/>
-      <w:bookmarkEnd w:id="39"/>
       <w:r>
         <w:rPr>
           <w:rFonts w:ascii="Times New Roman" w:hAnsi="Times New Roman" w:cs="Times New Roman"/>
@@ -17206,6 +17088,23 @@
 </file>
 
 <file path=customXml/item1.xml><?xml version="1.0" encoding="utf-8"?>
+<?mso-contentType ?>
+<FormTemplates xmlns="http://schemas.microsoft.com/sharepoint/v3/contenttype/forms">
+  <Display>DocumentLibraryForm</Display>
+  <Edit>DocumentLibraryForm</Edit>
+  <New>DocumentLibraryForm</New>
+</FormTemplates>
+</file>
+
+<file path=customXml/item2.xml><?xml version="1.0" encoding="utf-8"?>
+<p:properties xmlns:p="http://schemas.microsoft.com/office/2006/metadata/properties" xmlns:xsi="http://www.w3.org/2001/XMLSchema-instance" xmlns:pc="http://schemas.microsoft.com/office/infopath/2007/PartnerControls">
+  <documentManagement>
+    <_activity xmlns="7a7075c7-719f-4fa3-a2f0-2346c1b30043" xsi:nil="true"/>
+  </documentManagement>
+</p:properties>
+</file>
+
+<file path=customXml/item3.xml><?xml version="1.0" encoding="utf-8"?>
 <ct:contentTypeSchema xmlns:ct="http://schemas.microsoft.com/office/2006/metadata/contentType" xmlns:ma="http://schemas.microsoft.com/office/2006/metadata/properties/metaAttributes" ct:_="" ma:_="" ma:contentTypeName="Documento" ma:contentTypeID="0x01010004DF3DC73DD03A4DBFD9DAB9E3E1DB98" ma:contentTypeVersion="9" ma:contentTypeDescription="Crie um novo documento." ma:contentTypeScope="" ma:versionID="fa82eeb1e333e721eb4d9edca94a8a5a">
   <xsd:schema xmlns:xsd="http://www.w3.org/2001/XMLSchema" xmlns:xs="http://www.w3.org/2001/XMLSchema" xmlns:p="http://schemas.microsoft.com/office/2006/metadata/properties" xmlns:ns3="4c528334-ca12-4272-a9b4-d64ab01ccb2c" xmlns:ns4="7a7075c7-719f-4fa3-a2f0-2346c1b30043" targetNamespace="http://schemas.microsoft.com/office/2006/metadata/properties" ma:root="true" ma:fieldsID="7219b95092c51cf24d874ee844803b32" ns3:_="" ns4:_="">
     <xsd:import namespace="4c528334-ca12-4272-a9b4-d64ab01ccb2c"/>
@@ -17400,28 +17299,29 @@
 </ct:contentTypeSchema>
 </file>
 
-<file path=customXml/item2.xml><?xml version="1.0" encoding="utf-8"?>
-<p:properties xmlns:p="http://schemas.microsoft.com/office/2006/metadata/properties" xmlns:xsi="http://www.w3.org/2001/XMLSchema-instance" xmlns:pc="http://schemas.microsoft.com/office/infopath/2007/PartnerControls">
-  <documentManagement>
-    <_activity xmlns="7a7075c7-719f-4fa3-a2f0-2346c1b30043" xsi:nil="true"/>
-  </documentManagement>
-</p:properties>
-</file>
-
-<file path=customXml/item3.xml><?xml version="1.0" encoding="utf-8"?>
-<?mso-contentType ?>
-<FormTemplates xmlns="http://schemas.microsoft.com/sharepoint/v3/contenttype/forms">
-  <Display>DocumentLibraryForm</Display>
-  <Edit>DocumentLibraryForm</Edit>
-  <New>DocumentLibraryForm</New>
-</FormTemplates>
-</file>
-
 <file path=customXml/item4.xml><?xml version="1.0" encoding="utf-8"?>
 <b:Sources xmlns:b="http://schemas.openxmlformats.org/officeDocument/2006/bibliography" xmlns="http://schemas.openxmlformats.org/officeDocument/2006/bibliography" SelectedStyle="\APASixthEditionOfficeOnline.xsl" StyleName="APA" Version="6"/>
 </file>
 
 <file path=customXml/itemProps1.xml><?xml version="1.0" encoding="utf-8"?>
+<ds:datastoreItem xmlns:ds="http://schemas.openxmlformats.org/officeDocument/2006/customXml" ds:itemID="{F4A2C6B6-6235-4493-B188-224B1EE05A45}">
+  <ds:schemaRefs>
+    <ds:schemaRef ds:uri="http://schemas.microsoft.com/sharepoint/v3/contenttype/forms"/>
+  </ds:schemaRefs>
+</ds:datastoreItem>
+</file>
+
+<file path=customXml/itemProps2.xml><?xml version="1.0" encoding="utf-8"?>
+<ds:datastoreItem xmlns:ds="http://schemas.openxmlformats.org/officeDocument/2006/customXml" ds:itemID="{83A28076-18F7-4F6E-8D67-B3871704298C}">
+  <ds:schemaRefs>
+    <ds:schemaRef ds:uri="http://schemas.microsoft.com/office/2006/metadata/properties"/>
+    <ds:schemaRef ds:uri="http://schemas.microsoft.com/office/infopath/2007/PartnerControls"/>
+    <ds:schemaRef ds:uri="7a7075c7-719f-4fa3-a2f0-2346c1b30043"/>
+  </ds:schemaRefs>
+</ds:datastoreItem>
+</file>
+
+<file path=customXml/itemProps3.xml><?xml version="1.0" encoding="utf-8"?>
 <ds:datastoreItem xmlns:ds="http://schemas.openxmlformats.org/officeDocument/2006/customXml" ds:itemID="{156DCBA0-AAA0-4EA5-A878-79835756F6C5}">
   <ds:schemaRefs>
     <ds:schemaRef ds:uri="http://schemas.microsoft.com/office/2006/metadata/contentType"/>
@@ -17440,26 +17340,8 @@
 </ds:datastoreItem>
 </file>
 
-<file path=customXml/itemProps2.xml><?xml version="1.0" encoding="utf-8"?>
-<ds:datastoreItem xmlns:ds="http://schemas.openxmlformats.org/officeDocument/2006/customXml" ds:itemID="{83A28076-18F7-4F6E-8D67-B3871704298C}">
-  <ds:schemaRefs>
-    <ds:schemaRef ds:uri="http://schemas.microsoft.com/office/2006/metadata/properties"/>
-    <ds:schemaRef ds:uri="http://schemas.microsoft.com/office/infopath/2007/PartnerControls"/>
-    <ds:schemaRef ds:uri="7a7075c7-719f-4fa3-a2f0-2346c1b30043"/>
-  </ds:schemaRefs>
-</ds:datastoreItem>
-</file>
-
-<file path=customXml/itemProps3.xml><?xml version="1.0" encoding="utf-8"?>
-<ds:datastoreItem xmlns:ds="http://schemas.openxmlformats.org/officeDocument/2006/customXml" ds:itemID="{F4A2C6B6-6235-4493-B188-224B1EE05A45}">
-  <ds:schemaRefs>
-    <ds:schemaRef ds:uri="http://schemas.microsoft.com/sharepoint/v3/contenttype/forms"/>
-  </ds:schemaRefs>
-</ds:datastoreItem>
-</file>
-
 <file path=customXml/itemProps4.xml><?xml version="1.0" encoding="utf-8"?>
-<ds:datastoreItem xmlns:ds="http://schemas.openxmlformats.org/officeDocument/2006/customXml" ds:itemID="{512776DE-9EF0-482C-B0BB-85C6AC9B8D8E}">
+<ds:datastoreItem xmlns:ds="http://schemas.openxmlformats.org/officeDocument/2006/customXml" ds:itemID="{F1F7BE13-C80F-4115-866A-B633C6E0107A}">
   <ds:schemaRefs>
     <ds:schemaRef ds:uri="http://schemas.openxmlformats.org/officeDocument/2006/bibliography"/>
   </ds:schemaRefs>

</xml_diff>

<commit_message>
Doc: Ajustei as metodologias e organizei as pastas e arquivos da documentação
</commit_message>
<xml_diff>
--- a/Documentação/DOCUMENTO-SENAI-APEX-00.docx
+++ b/Documentação/DOCUMENTO-SENAI-APEX-00.docx
@@ -12,6 +12,8 @@
           <w:szCs w:val="28"/>
         </w:rPr>
       </w:pPr>
+      <w:bookmarkStart w:id="0" w:name="_GoBack"/>
+      <w:bookmarkEnd w:id="0"/>
       <w:r>
         <w:rPr>
           <w:rFonts w:ascii="Times New Roman" w:hAnsi="Times New Roman" w:cs="Times New Roman"/>
@@ -4428,25 +4430,7 @@
             <w:b/>
             <w:noProof/>
           </w:rPr>
-          <w:t>Figu</w:t>
-        </w:r>
-        <w:r>
-          <w:rPr>
-            <w:rStyle w:val="Hyperlink"/>
-            <w:rFonts w:ascii="Times New Roman" w:hAnsi="Times New Roman" w:cs="Times New Roman"/>
-            <w:b/>
-            <w:noProof/>
-          </w:rPr>
-          <w:t>r</w:t>
-        </w:r>
-        <w:r>
-          <w:rPr>
-            <w:rStyle w:val="Hyperlink"/>
-            <w:rFonts w:ascii="Times New Roman" w:hAnsi="Times New Roman" w:cs="Times New Roman"/>
-            <w:b/>
-            <w:noProof/>
-          </w:rPr>
-          <w:t xml:space="preserve">a 1 – </w:t>
+          <w:t xml:space="preserve">Figura 1 – </w:t>
         </w:r>
         <w:r>
           <w:rPr>
@@ -7051,8 +7035,8 @@
           <w:szCs w:val="24"/>
         </w:rPr>
       </w:pPr>
-      <w:bookmarkStart w:id="0" w:name="_Toc213056281"/>
-      <w:bookmarkStart w:id="1" w:name="_Toc221864879"/>
+      <w:bookmarkStart w:id="1" w:name="_Toc213056281"/>
+      <w:bookmarkStart w:id="2" w:name="_Toc221864879"/>
       <w:r>
         <w:rPr>
           <w:rFonts w:ascii="Times New Roman" w:hAnsi="Times New Roman" w:cs="Times New Roman"/>
@@ -7083,8 +7067,8 @@
         </w:rPr>
         <w:t>NTRODUÇÃO</w:t>
       </w:r>
-      <w:bookmarkEnd w:id="0"/>
       <w:bookmarkEnd w:id="1"/>
+      <w:bookmarkEnd w:id="2"/>
     </w:p>
     <w:p>
       <w:pPr>
@@ -7735,8 +7719,8 @@
           <w:szCs w:val="24"/>
         </w:rPr>
       </w:pPr>
-      <w:bookmarkStart w:id="2" w:name="_Toc213056282"/>
-      <w:bookmarkStart w:id="3" w:name="_Toc221864880"/>
+      <w:bookmarkStart w:id="3" w:name="_Toc213056282"/>
+      <w:bookmarkStart w:id="4" w:name="_Toc221864880"/>
       <w:r>
         <w:rPr>
           <w:rFonts w:ascii="Times New Roman" w:hAnsi="Times New Roman" w:cs="Times New Roman"/>
@@ -7758,8 +7742,8 @@
         </w:rPr>
         <w:t>DESENVOLVIMENTO</w:t>
       </w:r>
-      <w:bookmarkEnd w:id="2"/>
       <w:bookmarkEnd w:id="3"/>
+      <w:bookmarkEnd w:id="4"/>
     </w:p>
     <w:p>
       <w:pPr>
@@ -8246,8 +8230,8 @@
           <w:szCs w:val="24"/>
         </w:rPr>
       </w:pPr>
-      <w:bookmarkStart w:id="4" w:name="_Toc213056283"/>
-      <w:bookmarkStart w:id="5" w:name="_Toc221864881"/>
+      <w:bookmarkStart w:id="5" w:name="_Toc213056283"/>
+      <w:bookmarkStart w:id="6" w:name="_Toc221864881"/>
       <w:r>
         <w:rPr>
           <w:rFonts w:ascii="Times New Roman" w:hAnsi="Times New Roman" w:cs="Times New Roman"/>
@@ -8258,8 +8242,8 @@
         </w:rPr>
         <w:t>2.1 Objetivo geral</w:t>
       </w:r>
-      <w:bookmarkEnd w:id="4"/>
       <w:bookmarkEnd w:id="5"/>
+      <w:bookmarkEnd w:id="6"/>
     </w:p>
     <w:p>
       <w:pPr>
@@ -8458,8 +8442,8 @@
           <w:szCs w:val="24"/>
         </w:rPr>
       </w:pPr>
-      <w:bookmarkStart w:id="6" w:name="_Toc213056284"/>
-      <w:bookmarkStart w:id="7" w:name="_Toc221864882"/>
+      <w:bookmarkStart w:id="7" w:name="_Toc213056284"/>
+      <w:bookmarkStart w:id="8" w:name="_Toc221864882"/>
       <w:r>
         <w:rPr>
           <w:rFonts w:ascii="Times New Roman" w:hAnsi="Times New Roman" w:cs="Times New Roman"/>
@@ -8490,8 +8474,8 @@
         </w:rPr>
         <w:t xml:space="preserve"> Objetivos específicos</w:t>
       </w:r>
-      <w:bookmarkEnd w:id="6"/>
       <w:bookmarkEnd w:id="7"/>
+      <w:bookmarkEnd w:id="8"/>
     </w:p>
     <w:p>
       <w:pPr>
@@ -8723,8 +8707,8 @@
           <w:szCs w:val="24"/>
         </w:rPr>
       </w:pPr>
-      <w:bookmarkStart w:id="8" w:name="_Toc213056285"/>
-      <w:bookmarkStart w:id="9" w:name="_Toc221864883"/>
+      <w:bookmarkStart w:id="9" w:name="_Toc213056285"/>
+      <w:bookmarkStart w:id="10" w:name="_Toc221864883"/>
       <w:r>
         <w:rPr>
           <w:rFonts w:ascii="Times New Roman" w:hAnsi="Times New Roman" w:cs="Times New Roman"/>
@@ -8746,8 +8730,8 @@
         </w:rPr>
         <w:t>MÉTODOLOGIA</w:t>
       </w:r>
-      <w:bookmarkEnd w:id="8"/>
       <w:bookmarkEnd w:id="9"/>
+      <w:bookmarkEnd w:id="10"/>
     </w:p>
     <w:p>
       <w:pPr>
@@ -8790,316 +8774,6 @@
         <w:spacing w:after="0" w:line="360" w:lineRule="auto"/>
         <w:rPr>
           <w:rFonts w:ascii="Times New Roman" w:hAnsi="Times New Roman" w:cs="Times New Roman"/>
-          <w:sz w:val="24"/>
-          <w:szCs w:val="24"/>
-        </w:rPr>
-      </w:pPr>
-    </w:p>
-    <w:p>
-      <w:pPr>
-        <w:spacing w:after="0" w:line="360" w:lineRule="auto"/>
-        <w:rPr>
-          <w:rFonts w:ascii="Times New Roman" w:hAnsi="Times New Roman" w:cs="Times New Roman"/>
-          <w:b/>
-          <w:bCs/>
-          <w:sz w:val="24"/>
-          <w:szCs w:val="24"/>
-        </w:rPr>
-      </w:pPr>
-    </w:p>
-    <w:p>
-      <w:pPr>
-        <w:spacing w:after="0" w:line="360" w:lineRule="auto"/>
-        <w:rPr>
-          <w:rFonts w:ascii="Times New Roman" w:hAnsi="Times New Roman" w:cs="Times New Roman"/>
-          <w:b/>
-          <w:bCs/>
-          <w:sz w:val="24"/>
-          <w:szCs w:val="24"/>
-        </w:rPr>
-      </w:pPr>
-    </w:p>
-    <w:p>
-      <w:pPr>
-        <w:spacing w:after="0" w:line="360" w:lineRule="auto"/>
-        <w:rPr>
-          <w:rFonts w:ascii="Times New Roman" w:hAnsi="Times New Roman" w:cs="Times New Roman"/>
-          <w:b/>
-          <w:bCs/>
-          <w:sz w:val="24"/>
-          <w:szCs w:val="24"/>
-        </w:rPr>
-      </w:pPr>
-    </w:p>
-    <w:p>
-      <w:pPr>
-        <w:spacing w:after="0" w:line="360" w:lineRule="auto"/>
-        <w:rPr>
-          <w:rFonts w:ascii="Times New Roman" w:hAnsi="Times New Roman" w:cs="Times New Roman"/>
-          <w:b/>
-          <w:bCs/>
-          <w:sz w:val="24"/>
-          <w:szCs w:val="24"/>
-        </w:rPr>
-      </w:pPr>
-    </w:p>
-    <w:p>
-      <w:pPr>
-        <w:spacing w:after="0" w:line="360" w:lineRule="auto"/>
-        <w:rPr>
-          <w:rFonts w:ascii="Times New Roman" w:hAnsi="Times New Roman" w:cs="Times New Roman"/>
-          <w:b/>
-          <w:bCs/>
-          <w:sz w:val="24"/>
-          <w:szCs w:val="24"/>
-        </w:rPr>
-      </w:pPr>
-    </w:p>
-    <w:p>
-      <w:pPr>
-        <w:spacing w:after="0" w:line="360" w:lineRule="auto"/>
-        <w:rPr>
-          <w:rFonts w:ascii="Times New Roman" w:hAnsi="Times New Roman" w:cs="Times New Roman"/>
-          <w:b/>
-          <w:bCs/>
-          <w:sz w:val="24"/>
-          <w:szCs w:val="24"/>
-        </w:rPr>
-      </w:pPr>
-    </w:p>
-    <w:p>
-      <w:pPr>
-        <w:spacing w:after="0" w:line="360" w:lineRule="auto"/>
-        <w:rPr>
-          <w:rFonts w:ascii="Times New Roman" w:hAnsi="Times New Roman" w:cs="Times New Roman"/>
-          <w:b/>
-          <w:bCs/>
-          <w:sz w:val="24"/>
-          <w:szCs w:val="24"/>
-        </w:rPr>
-      </w:pPr>
-    </w:p>
-    <w:p>
-      <w:pPr>
-        <w:spacing w:after="0" w:line="360" w:lineRule="auto"/>
-        <w:rPr>
-          <w:rFonts w:ascii="Times New Roman" w:hAnsi="Times New Roman" w:cs="Times New Roman"/>
-          <w:b/>
-          <w:bCs/>
-          <w:sz w:val="24"/>
-          <w:szCs w:val="24"/>
-        </w:rPr>
-      </w:pPr>
-    </w:p>
-    <w:p>
-      <w:pPr>
-        <w:spacing w:after="0" w:line="360" w:lineRule="auto"/>
-        <w:rPr>
-          <w:rFonts w:ascii="Times New Roman" w:hAnsi="Times New Roman" w:cs="Times New Roman"/>
-          <w:b/>
-          <w:bCs/>
-          <w:sz w:val="24"/>
-          <w:szCs w:val="24"/>
-        </w:rPr>
-      </w:pPr>
-    </w:p>
-    <w:p>
-      <w:pPr>
-        <w:spacing w:after="0" w:line="360" w:lineRule="auto"/>
-        <w:rPr>
-          <w:rFonts w:ascii="Times New Roman" w:hAnsi="Times New Roman" w:cs="Times New Roman"/>
-          <w:b/>
-          <w:bCs/>
-          <w:sz w:val="24"/>
-          <w:szCs w:val="24"/>
-        </w:rPr>
-      </w:pPr>
-    </w:p>
-    <w:p>
-      <w:pPr>
-        <w:spacing w:after="0" w:line="360" w:lineRule="auto"/>
-        <w:rPr>
-          <w:rFonts w:ascii="Times New Roman" w:hAnsi="Times New Roman" w:cs="Times New Roman"/>
-          <w:b/>
-          <w:bCs/>
-          <w:sz w:val="24"/>
-          <w:szCs w:val="24"/>
-        </w:rPr>
-      </w:pPr>
-    </w:p>
-    <w:p>
-      <w:pPr>
-        <w:spacing w:after="0" w:line="360" w:lineRule="auto"/>
-        <w:rPr>
-          <w:rFonts w:ascii="Times New Roman" w:hAnsi="Times New Roman" w:cs="Times New Roman"/>
-          <w:b/>
-          <w:bCs/>
-          <w:sz w:val="24"/>
-          <w:szCs w:val="24"/>
-        </w:rPr>
-      </w:pPr>
-    </w:p>
-    <w:p>
-      <w:pPr>
-        <w:spacing w:after="0" w:line="360" w:lineRule="auto"/>
-        <w:rPr>
-          <w:rFonts w:ascii="Times New Roman" w:hAnsi="Times New Roman" w:cs="Times New Roman"/>
-          <w:b/>
-          <w:bCs/>
-          <w:sz w:val="24"/>
-          <w:szCs w:val="24"/>
-        </w:rPr>
-      </w:pPr>
-    </w:p>
-    <w:p>
-      <w:pPr>
-        <w:spacing w:after="0" w:line="360" w:lineRule="auto"/>
-        <w:rPr>
-          <w:rFonts w:ascii="Times New Roman" w:hAnsi="Times New Roman" w:cs="Times New Roman"/>
-          <w:b/>
-          <w:bCs/>
-          <w:sz w:val="24"/>
-          <w:szCs w:val="24"/>
-        </w:rPr>
-      </w:pPr>
-    </w:p>
-    <w:p>
-      <w:pPr>
-        <w:spacing w:after="0" w:line="360" w:lineRule="auto"/>
-        <w:rPr>
-          <w:rFonts w:ascii="Times New Roman" w:hAnsi="Times New Roman" w:cs="Times New Roman"/>
-          <w:b/>
-          <w:bCs/>
-          <w:sz w:val="24"/>
-          <w:szCs w:val="24"/>
-        </w:rPr>
-      </w:pPr>
-    </w:p>
-    <w:p>
-      <w:pPr>
-        <w:spacing w:after="0" w:line="360" w:lineRule="auto"/>
-        <w:rPr>
-          <w:rFonts w:ascii="Times New Roman" w:hAnsi="Times New Roman" w:cs="Times New Roman"/>
-          <w:b/>
-          <w:bCs/>
-          <w:sz w:val="24"/>
-          <w:szCs w:val="24"/>
-        </w:rPr>
-      </w:pPr>
-    </w:p>
-    <w:p>
-      <w:pPr>
-        <w:spacing w:after="0" w:line="360" w:lineRule="auto"/>
-        <w:rPr>
-          <w:rFonts w:ascii="Times New Roman" w:hAnsi="Times New Roman" w:cs="Times New Roman"/>
-          <w:b/>
-          <w:bCs/>
-          <w:sz w:val="24"/>
-          <w:szCs w:val="24"/>
-        </w:rPr>
-      </w:pPr>
-    </w:p>
-    <w:p>
-      <w:pPr>
-        <w:spacing w:after="0" w:line="360" w:lineRule="auto"/>
-        <w:rPr>
-          <w:rFonts w:ascii="Times New Roman" w:hAnsi="Times New Roman" w:cs="Times New Roman"/>
-          <w:b/>
-          <w:bCs/>
-          <w:sz w:val="24"/>
-          <w:szCs w:val="24"/>
-        </w:rPr>
-      </w:pPr>
-    </w:p>
-    <w:p>
-      <w:pPr>
-        <w:spacing w:after="0" w:line="360" w:lineRule="auto"/>
-        <w:rPr>
-          <w:rFonts w:ascii="Times New Roman" w:hAnsi="Times New Roman" w:cs="Times New Roman"/>
-          <w:b/>
-          <w:bCs/>
-          <w:sz w:val="24"/>
-          <w:szCs w:val="24"/>
-        </w:rPr>
-      </w:pPr>
-    </w:p>
-    <w:p>
-      <w:pPr>
-        <w:spacing w:after="0" w:line="360" w:lineRule="auto"/>
-        <w:rPr>
-          <w:rFonts w:ascii="Times New Roman" w:hAnsi="Times New Roman" w:cs="Times New Roman"/>
-          <w:b/>
-          <w:bCs/>
-          <w:sz w:val="24"/>
-          <w:szCs w:val="24"/>
-        </w:rPr>
-      </w:pPr>
-    </w:p>
-    <w:p>
-      <w:pPr>
-        <w:spacing w:after="0" w:line="360" w:lineRule="auto"/>
-        <w:rPr>
-          <w:rFonts w:ascii="Times New Roman" w:hAnsi="Times New Roman" w:cs="Times New Roman"/>
-          <w:b/>
-          <w:bCs/>
-          <w:sz w:val="24"/>
-          <w:szCs w:val="24"/>
-        </w:rPr>
-      </w:pPr>
-    </w:p>
-    <w:p>
-      <w:pPr>
-        <w:spacing w:after="0" w:line="360" w:lineRule="auto"/>
-        <w:rPr>
-          <w:rFonts w:ascii="Times New Roman" w:hAnsi="Times New Roman" w:cs="Times New Roman"/>
-          <w:b/>
-          <w:bCs/>
-          <w:sz w:val="24"/>
-          <w:szCs w:val="24"/>
-        </w:rPr>
-      </w:pPr>
-    </w:p>
-    <w:p>
-      <w:pPr>
-        <w:spacing w:after="0" w:line="360" w:lineRule="auto"/>
-        <w:rPr>
-          <w:rFonts w:ascii="Times New Roman" w:hAnsi="Times New Roman" w:cs="Times New Roman"/>
-          <w:b/>
-          <w:bCs/>
-          <w:sz w:val="24"/>
-          <w:szCs w:val="24"/>
-        </w:rPr>
-      </w:pPr>
-    </w:p>
-    <w:p>
-      <w:pPr>
-        <w:spacing w:after="0" w:line="360" w:lineRule="auto"/>
-        <w:rPr>
-          <w:rFonts w:ascii="Times New Roman" w:hAnsi="Times New Roman" w:cs="Times New Roman"/>
-          <w:b/>
-          <w:bCs/>
-          <w:sz w:val="24"/>
-          <w:szCs w:val="24"/>
-        </w:rPr>
-      </w:pPr>
-    </w:p>
-    <w:p>
-      <w:pPr>
-        <w:spacing w:after="0" w:line="360" w:lineRule="auto"/>
-        <w:rPr>
-          <w:rFonts w:ascii="Times New Roman" w:hAnsi="Times New Roman" w:cs="Times New Roman"/>
-          <w:b/>
-          <w:bCs/>
-          <w:sz w:val="24"/>
-          <w:szCs w:val="24"/>
-        </w:rPr>
-      </w:pPr>
-    </w:p>
-    <w:p>
-      <w:pPr>
-        <w:spacing w:after="0" w:line="360" w:lineRule="auto"/>
-        <w:rPr>
-          <w:rFonts w:ascii="Times New Roman" w:hAnsi="Times New Roman" w:cs="Times New Roman"/>
           <w:b/>
           <w:bCs/>
           <w:sz w:val="24"/>
@@ -9119,17 +8793,16 @@
           <w:szCs w:val="24"/>
         </w:rPr>
       </w:pPr>
-      <w:bookmarkStart w:id="10" w:name="_Toc213056286"/>
-      <w:bookmarkStart w:id="11" w:name="_Toc221864884"/>
-      <w:r>
-        <w:rPr>
-          <w:rFonts w:ascii="Times New Roman" w:hAnsi="Times New Roman" w:cs="Times New Roman"/>
-          <w:b/>
-          <w:bCs/>
-          <w:sz w:val="24"/>
-          <w:szCs w:val="24"/>
-        </w:rPr>
-        <w:lastRenderedPageBreak/>
+      <w:bookmarkStart w:id="11" w:name="_Toc213056286"/>
+      <w:bookmarkStart w:id="12" w:name="_Toc221864884"/>
+      <w:r>
+        <w:rPr>
+          <w:rFonts w:ascii="Times New Roman" w:hAnsi="Times New Roman" w:cs="Times New Roman"/>
+          <w:b/>
+          <w:bCs/>
+          <w:sz w:val="24"/>
+          <w:szCs w:val="24"/>
+        </w:rPr>
         <w:t>4</w:t>
       </w:r>
       <w:r>
@@ -9172,8 +8845,8 @@
         </w:rPr>
         <w:t>S</w:t>
       </w:r>
-      <w:bookmarkEnd w:id="10"/>
       <w:bookmarkEnd w:id="11"/>
+      <w:bookmarkEnd w:id="12"/>
     </w:p>
     <w:p>
       <w:pPr>
@@ -9187,8 +8860,8 @@
           <w:szCs w:val="24"/>
         </w:rPr>
       </w:pPr>
-      <w:bookmarkStart w:id="12" w:name="_Toc213056287"/>
-      <w:bookmarkStart w:id="13" w:name="_Toc221864885"/>
+      <w:bookmarkStart w:id="13" w:name="_Toc213056287"/>
+      <w:bookmarkStart w:id="14" w:name="_Toc221864885"/>
       <w:r>
         <w:rPr>
           <w:rFonts w:ascii="Times New Roman" w:hAnsi="Times New Roman" w:cs="Times New Roman"/>
@@ -9210,8 +8883,8 @@
         </w:rPr>
         <w:t>VsCode</w:t>
       </w:r>
-      <w:bookmarkEnd w:id="12"/>
       <w:bookmarkEnd w:id="13"/>
+      <w:bookmarkEnd w:id="14"/>
       <w:proofErr w:type="spellEnd"/>
     </w:p>
     <w:p>
@@ -9504,7 +9177,7 @@
           <w:szCs w:val="24"/>
         </w:rPr>
       </w:pPr>
-      <w:bookmarkStart w:id="14" w:name="_Toc215495515"/>
+      <w:bookmarkStart w:id="15" w:name="_Toc215495515"/>
       <w:r>
         <w:rPr>
           <w:rFonts w:ascii="Times New Roman" w:hAnsi="Times New Roman" w:cs="Times New Roman"/>
@@ -9514,6 +9187,7 @@
           <w:sz w:val="24"/>
           <w:szCs w:val="24"/>
         </w:rPr>
+        <w:lastRenderedPageBreak/>
         <w:t xml:space="preserve">Figura </w:t>
       </w:r>
       <w:r>
@@ -9604,7 +9278,7 @@
         </w:rPr>
         <w:t>VsCode</w:t>
       </w:r>
-      <w:bookmarkEnd w:id="14"/>
+      <w:bookmarkEnd w:id="15"/>
       <w:proofErr w:type="spellEnd"/>
     </w:p>
     <w:p>
@@ -9613,6 +9287,9 @@
         <w:spacing w:after="0" w:line="360" w:lineRule="auto"/>
       </w:pPr>
       <w:r>
+        <w:rPr>
+          <w:noProof/>
+        </w:rPr>
         <w:drawing>
           <wp:inline distT="0" distB="0" distL="0" distR="0" wp14:anchorId="7B8A9699" wp14:editId="16CF5075">
             <wp:extent cx="5760085" cy="3109595"/>
@@ -9724,8 +9401,8 @@
           <w:szCs w:val="24"/>
         </w:rPr>
       </w:pPr>
-      <w:bookmarkStart w:id="15" w:name="_Toc213056288"/>
-      <w:bookmarkStart w:id="16" w:name="_Toc221864886"/>
+      <w:bookmarkStart w:id="16" w:name="_Toc213056288"/>
+      <w:bookmarkStart w:id="17" w:name="_Toc221864886"/>
       <w:r>
         <w:rPr>
           <w:rFonts w:ascii="Times New Roman" w:hAnsi="Times New Roman" w:cs="Times New Roman"/>
@@ -9736,8 +9413,8 @@
         </w:rPr>
         <w:t>4.2 HTML</w:t>
       </w:r>
-      <w:bookmarkEnd w:id="15"/>
       <w:bookmarkEnd w:id="16"/>
+      <w:bookmarkEnd w:id="17"/>
     </w:p>
     <w:p>
       <w:pPr>
@@ -9998,7 +9675,16 @@
           <w:sz w:val="24"/>
           <w:szCs w:val="24"/>
         </w:rPr>
-        <w:t xml:space="preserve">garantindo que o projeto seja funcional, interativo e compatível com padrões modernos de desenvolvimento web. </w:t>
+        <w:t xml:space="preserve">garantindo que o projeto seja funcional, interativo e compatível com </w:t>
+      </w:r>
+      <w:r>
+        <w:rPr>
+          <w:rFonts w:ascii="Times New Roman" w:hAnsi="Times New Roman" w:cs="Times New Roman"/>
+          <w:sz w:val="24"/>
+          <w:szCs w:val="24"/>
+        </w:rPr>
+        <w:lastRenderedPageBreak/>
+        <w:t xml:space="preserve">padrões modernos de desenvolvimento web. </w:t>
       </w:r>
       <w:r>
         <w:rPr>
@@ -10061,9 +9747,7 @@
           <w:szCs w:val="24"/>
         </w:rPr>
       </w:pPr>
-      <w:bookmarkStart w:id="17" w:name="_Toc215495516"/>
-      <w:bookmarkStart w:id="18" w:name="_GoBack"/>
-      <w:bookmarkEnd w:id="18"/>
+      <w:bookmarkStart w:id="18" w:name="_Toc215495516"/>
       <w:r>
         <w:rPr>
           <w:rFonts w:ascii="Times New Roman" w:hAnsi="Times New Roman" w:cs="Times New Roman"/>
@@ -10073,7 +9757,6 @@
           <w:sz w:val="24"/>
           <w:szCs w:val="24"/>
         </w:rPr>
-        <w:lastRenderedPageBreak/>
         <w:t xml:space="preserve">Figura </w:t>
       </w:r>
       <w:r>
@@ -10153,20 +9836,21 @@
         </w:rPr>
         <w:t>HTML</w:t>
       </w:r>
-      <w:bookmarkEnd w:id="17"/>
-    </w:p>
-    <w:p>
-      <w:pPr>
-        <w:spacing w:after="0" w:line="360" w:lineRule="auto"/>
-        <w:rPr>
-          <w:rFonts w:ascii="Times New Roman" w:hAnsi="Times New Roman" w:cs="Times New Roman"/>
-          <w:sz w:val="24"/>
-          <w:szCs w:val="24"/>
-        </w:rPr>
-      </w:pPr>
-      <w:r>
-        <w:rPr>
-          <w:rFonts w:ascii="Times New Roman" w:hAnsi="Times New Roman" w:cs="Times New Roman"/>
+      <w:bookmarkEnd w:id="18"/>
+    </w:p>
+    <w:p>
+      <w:pPr>
+        <w:spacing w:after="0" w:line="360" w:lineRule="auto"/>
+        <w:rPr>
+          <w:rFonts w:ascii="Times New Roman" w:hAnsi="Times New Roman" w:cs="Times New Roman"/>
+          <w:sz w:val="24"/>
+          <w:szCs w:val="24"/>
+        </w:rPr>
+      </w:pPr>
+      <w:r>
+        <w:rPr>
+          <w:rFonts w:ascii="Times New Roman" w:hAnsi="Times New Roman" w:cs="Times New Roman"/>
+          <w:noProof/>
           <w:sz w:val="24"/>
           <w:szCs w:val="24"/>
         </w:rPr>
@@ -10501,6 +10185,7 @@
       <w:r>
         <w:rPr>
           <w:rFonts w:ascii="Times New Roman" w:hAnsi="Times New Roman" w:cs="Times New Roman"/>
+          <w:noProof/>
           <w:sz w:val="24"/>
           <w:szCs w:val="24"/>
         </w:rPr>
@@ -10566,70 +10251,6 @@
     <w:p>
       <w:pPr>
         <w:spacing w:after="0" w:line="360" w:lineRule="auto"/>
-        <w:rPr>
-          <w:rFonts w:ascii="Times New Roman" w:hAnsi="Times New Roman" w:cs="Times New Roman"/>
-        </w:rPr>
-      </w:pPr>
-    </w:p>
-    <w:p>
-      <w:pPr>
-        <w:spacing w:after="0" w:line="360" w:lineRule="auto"/>
-        <w:rPr>
-          <w:rFonts w:ascii="Times New Roman" w:hAnsi="Times New Roman" w:cs="Times New Roman"/>
-        </w:rPr>
-      </w:pPr>
-    </w:p>
-    <w:p>
-      <w:pPr>
-        <w:spacing w:after="0" w:line="360" w:lineRule="auto"/>
-        <w:rPr>
-          <w:rFonts w:ascii="Times New Roman" w:hAnsi="Times New Roman" w:cs="Times New Roman"/>
-        </w:rPr>
-      </w:pPr>
-    </w:p>
-    <w:p>
-      <w:pPr>
-        <w:spacing w:after="0" w:line="360" w:lineRule="auto"/>
-        <w:rPr>
-          <w:rFonts w:ascii="Times New Roman" w:hAnsi="Times New Roman" w:cs="Times New Roman"/>
-        </w:rPr>
-      </w:pPr>
-    </w:p>
-    <w:p>
-      <w:pPr>
-        <w:spacing w:after="0" w:line="360" w:lineRule="auto"/>
-        <w:rPr>
-          <w:rFonts w:ascii="Times New Roman" w:hAnsi="Times New Roman" w:cs="Times New Roman"/>
-        </w:rPr>
-      </w:pPr>
-    </w:p>
-    <w:p>
-      <w:pPr>
-        <w:spacing w:after="0" w:line="360" w:lineRule="auto"/>
-        <w:rPr>
-          <w:rFonts w:ascii="Times New Roman" w:hAnsi="Times New Roman" w:cs="Times New Roman"/>
-        </w:rPr>
-      </w:pPr>
-    </w:p>
-    <w:p>
-      <w:pPr>
-        <w:spacing w:after="0" w:line="360" w:lineRule="auto"/>
-        <w:rPr>
-          <w:rFonts w:ascii="Times New Roman" w:hAnsi="Times New Roman" w:cs="Times New Roman"/>
-        </w:rPr>
-      </w:pPr>
-    </w:p>
-    <w:p>
-      <w:pPr>
-        <w:spacing w:after="0" w:line="360" w:lineRule="auto"/>
-        <w:rPr>
-          <w:rFonts w:ascii="Times New Roman" w:hAnsi="Times New Roman" w:cs="Times New Roman"/>
-        </w:rPr>
-      </w:pPr>
-    </w:p>
-    <w:p>
-      <w:pPr>
-        <w:spacing w:after="0" w:line="360" w:lineRule="auto"/>
         <w:outlineLvl w:val="1"/>
         <w:rPr>
           <w:rFonts w:ascii="Times New Roman" w:hAnsi="Times New Roman" w:cs="Times New Roman"/>
@@ -10662,7 +10283,6 @@
           <w:sz w:val="24"/>
           <w:szCs w:val="24"/>
         </w:rPr>
-        <w:lastRenderedPageBreak/>
         <w:t xml:space="preserve">4.4 </w:t>
       </w:r>
       <w:proofErr w:type="spellStart"/>
@@ -10861,6 +10481,7 @@
           <w:sz w:val="24"/>
           <w:szCs w:val="24"/>
         </w:rPr>
+        <w:lastRenderedPageBreak/>
         <w:t xml:space="preserve">No projeto, o </w:t>
       </w:r>
       <w:proofErr w:type="spellStart"/>
@@ -11044,6 +10665,7 @@
           <w:rFonts w:ascii="Times New Roman" w:hAnsi="Times New Roman" w:cs="Times New Roman"/>
           <w:b/>
           <w:bCs/>
+          <w:noProof/>
           <w:sz w:val="24"/>
           <w:szCs w:val="24"/>
         </w:rPr>
@@ -11089,14 +10711,147 @@
         <w:spacing w:after="0" w:line="360" w:lineRule="auto"/>
         <w:rPr>
           <w:rFonts w:ascii="Times New Roman" w:hAnsi="Times New Roman" w:cs="Times New Roman"/>
-        </w:rPr>
-      </w:pPr>
-      <w:r>
-        <w:rPr>
-          <w:rFonts w:ascii="Times New Roman" w:hAnsi="Times New Roman" w:cs="Times New Roman"/>
-          <w:b/>
-          <w:bCs/>
-        </w:rPr>
+          <w:b/>
+          <w:bCs/>
+          <w:sz w:val="24"/>
+          <w:szCs w:val="24"/>
+        </w:rPr>
+      </w:pPr>
+    </w:p>
+    <w:p>
+      <w:pPr>
+        <w:spacing w:after="0" w:line="360" w:lineRule="auto"/>
+        <w:rPr>
+          <w:rFonts w:ascii="Times New Roman" w:hAnsi="Times New Roman" w:cs="Times New Roman"/>
+          <w:b/>
+          <w:bCs/>
+          <w:sz w:val="24"/>
+          <w:szCs w:val="24"/>
+        </w:rPr>
+      </w:pPr>
+    </w:p>
+    <w:p>
+      <w:pPr>
+        <w:spacing w:after="0" w:line="360" w:lineRule="auto"/>
+        <w:rPr>
+          <w:rFonts w:ascii="Times New Roman" w:hAnsi="Times New Roman" w:cs="Times New Roman"/>
+          <w:b/>
+          <w:bCs/>
+          <w:sz w:val="24"/>
+          <w:szCs w:val="24"/>
+        </w:rPr>
+      </w:pPr>
+    </w:p>
+    <w:p>
+      <w:pPr>
+        <w:spacing w:after="0" w:line="360" w:lineRule="auto"/>
+        <w:rPr>
+          <w:rFonts w:ascii="Times New Roman" w:hAnsi="Times New Roman" w:cs="Times New Roman"/>
+          <w:b/>
+          <w:bCs/>
+          <w:sz w:val="24"/>
+          <w:szCs w:val="24"/>
+        </w:rPr>
+      </w:pPr>
+    </w:p>
+    <w:p>
+      <w:pPr>
+        <w:spacing w:after="0" w:line="360" w:lineRule="auto"/>
+        <w:rPr>
+          <w:rFonts w:ascii="Times New Roman" w:hAnsi="Times New Roman" w:cs="Times New Roman"/>
+          <w:b/>
+          <w:bCs/>
+          <w:sz w:val="24"/>
+          <w:szCs w:val="24"/>
+        </w:rPr>
+      </w:pPr>
+    </w:p>
+    <w:p>
+      <w:pPr>
+        <w:spacing w:after="0" w:line="360" w:lineRule="auto"/>
+        <w:rPr>
+          <w:rFonts w:ascii="Times New Roman" w:hAnsi="Times New Roman" w:cs="Times New Roman"/>
+          <w:b/>
+          <w:bCs/>
+          <w:sz w:val="24"/>
+          <w:szCs w:val="24"/>
+        </w:rPr>
+      </w:pPr>
+    </w:p>
+    <w:p>
+      <w:pPr>
+        <w:spacing w:after="0" w:line="360" w:lineRule="auto"/>
+        <w:rPr>
+          <w:rFonts w:ascii="Times New Roman" w:hAnsi="Times New Roman" w:cs="Times New Roman"/>
+          <w:b/>
+          <w:bCs/>
+          <w:sz w:val="24"/>
+          <w:szCs w:val="24"/>
+        </w:rPr>
+      </w:pPr>
+    </w:p>
+    <w:p>
+      <w:pPr>
+        <w:spacing w:after="0" w:line="360" w:lineRule="auto"/>
+        <w:rPr>
+          <w:rFonts w:ascii="Times New Roman" w:hAnsi="Times New Roman" w:cs="Times New Roman"/>
+          <w:b/>
+          <w:bCs/>
+          <w:sz w:val="24"/>
+          <w:szCs w:val="24"/>
+        </w:rPr>
+      </w:pPr>
+    </w:p>
+    <w:p>
+      <w:pPr>
+        <w:spacing w:after="0" w:line="360" w:lineRule="auto"/>
+        <w:rPr>
+          <w:rFonts w:ascii="Times New Roman" w:hAnsi="Times New Roman" w:cs="Times New Roman"/>
+          <w:b/>
+          <w:bCs/>
+          <w:sz w:val="24"/>
+          <w:szCs w:val="24"/>
+        </w:rPr>
+      </w:pPr>
+    </w:p>
+    <w:p>
+      <w:pPr>
+        <w:spacing w:after="0" w:line="360" w:lineRule="auto"/>
+        <w:rPr>
+          <w:rFonts w:ascii="Times New Roman" w:hAnsi="Times New Roman" w:cs="Times New Roman"/>
+          <w:b/>
+          <w:bCs/>
+          <w:sz w:val="24"/>
+          <w:szCs w:val="24"/>
+        </w:rPr>
+      </w:pPr>
+    </w:p>
+    <w:p>
+      <w:pPr>
+        <w:spacing w:after="0" w:line="360" w:lineRule="auto"/>
+        <w:rPr>
+          <w:rFonts w:ascii="Times New Roman" w:hAnsi="Times New Roman" w:cs="Times New Roman"/>
+          <w:b/>
+          <w:bCs/>
+          <w:sz w:val="24"/>
+          <w:szCs w:val="24"/>
+        </w:rPr>
+      </w:pPr>
+    </w:p>
+    <w:p>
+      <w:pPr>
+        <w:spacing w:after="0" w:line="360" w:lineRule="auto"/>
+        <w:rPr>
+          <w:rFonts w:ascii="Times New Roman" w:hAnsi="Times New Roman" w:cs="Times New Roman"/>
+        </w:rPr>
+      </w:pPr>
+      <w:r>
+        <w:rPr>
+          <w:rFonts w:ascii="Times New Roman" w:hAnsi="Times New Roman" w:cs="Times New Roman"/>
+          <w:b/>
+          <w:bCs/>
+        </w:rPr>
+        <w:lastRenderedPageBreak/>
         <w:t xml:space="preserve">Fonte: </w:t>
       </w:r>
       <w:r>
@@ -11105,58 +10860,6 @@
         </w:rPr>
         <w:t>Os autores</w:t>
       </w:r>
-    </w:p>
-    <w:p>
-      <w:pPr>
-        <w:spacing w:after="0" w:line="360" w:lineRule="auto"/>
-        <w:outlineLvl w:val="1"/>
-        <w:rPr>
-          <w:rFonts w:ascii="Times New Roman" w:hAnsi="Times New Roman" w:cs="Times New Roman"/>
-          <w:b/>
-          <w:bCs/>
-          <w:sz w:val="24"/>
-          <w:szCs w:val="24"/>
-        </w:rPr>
-      </w:pPr>
-    </w:p>
-    <w:p>
-      <w:pPr>
-        <w:spacing w:after="0" w:line="360" w:lineRule="auto"/>
-        <w:outlineLvl w:val="1"/>
-        <w:rPr>
-          <w:rFonts w:ascii="Times New Roman" w:hAnsi="Times New Roman" w:cs="Times New Roman"/>
-          <w:b/>
-          <w:bCs/>
-          <w:sz w:val="24"/>
-          <w:szCs w:val="24"/>
-        </w:rPr>
-      </w:pPr>
-    </w:p>
-    <w:p>
-      <w:pPr>
-        <w:spacing w:after="0" w:line="360" w:lineRule="auto"/>
-        <w:outlineLvl w:val="1"/>
-        <w:rPr>
-          <w:rFonts w:ascii="Times New Roman" w:hAnsi="Times New Roman" w:cs="Times New Roman"/>
-          <w:b/>
-          <w:bCs/>
-          <w:sz w:val="24"/>
-          <w:szCs w:val="24"/>
-        </w:rPr>
-      </w:pPr>
-    </w:p>
-    <w:p>
-      <w:pPr>
-        <w:spacing w:after="0" w:line="360" w:lineRule="auto"/>
-        <w:outlineLvl w:val="1"/>
-        <w:rPr>
-          <w:rFonts w:ascii="Times New Roman" w:hAnsi="Times New Roman" w:cs="Times New Roman"/>
-          <w:b/>
-          <w:bCs/>
-          <w:sz w:val="24"/>
-          <w:szCs w:val="24"/>
-        </w:rPr>
-      </w:pPr>
     </w:p>
     <w:p>
       <w:pPr>
@@ -11476,7 +11179,6 @@
           <w:sz w:val="24"/>
           <w:szCs w:val="24"/>
         </w:rPr>
-        <w:lastRenderedPageBreak/>
         <w:t xml:space="preserve">Figura </w:t>
       </w:r>
       <w:r>
@@ -11619,6 +11321,7 @@
           <w:b/>
           <w:bCs/>
         </w:rPr>
+        <w:lastRenderedPageBreak/>
         <w:t xml:space="preserve">Fonte: </w:t>
       </w:r>
       <w:r>
@@ -11627,78 +11330,6 @@
         </w:rPr>
         <w:t>Os autores</w:t>
       </w:r>
-    </w:p>
-    <w:p>
-      <w:pPr>
-        <w:spacing w:after="0" w:line="360" w:lineRule="auto"/>
-        <w:rPr>
-          <w:rFonts w:ascii="Times New Roman" w:hAnsi="Times New Roman" w:cs="Times New Roman"/>
-          <w:b/>
-          <w:bCs/>
-          <w:sz w:val="24"/>
-          <w:szCs w:val="24"/>
-        </w:rPr>
-      </w:pPr>
-    </w:p>
-    <w:p>
-      <w:pPr>
-        <w:spacing w:after="0" w:line="360" w:lineRule="auto"/>
-        <w:rPr>
-          <w:rFonts w:ascii="Times New Roman" w:hAnsi="Times New Roman" w:cs="Times New Roman"/>
-          <w:b/>
-          <w:bCs/>
-          <w:sz w:val="24"/>
-          <w:szCs w:val="24"/>
-        </w:rPr>
-      </w:pPr>
-    </w:p>
-    <w:p>
-      <w:pPr>
-        <w:spacing w:after="0" w:line="360" w:lineRule="auto"/>
-        <w:rPr>
-          <w:rFonts w:ascii="Times New Roman" w:hAnsi="Times New Roman" w:cs="Times New Roman"/>
-          <w:b/>
-          <w:bCs/>
-          <w:sz w:val="24"/>
-          <w:szCs w:val="24"/>
-        </w:rPr>
-      </w:pPr>
-    </w:p>
-    <w:p>
-      <w:pPr>
-        <w:spacing w:after="0" w:line="360" w:lineRule="auto"/>
-        <w:rPr>
-          <w:rFonts w:ascii="Times New Roman" w:hAnsi="Times New Roman" w:cs="Times New Roman"/>
-          <w:b/>
-          <w:bCs/>
-          <w:sz w:val="24"/>
-          <w:szCs w:val="24"/>
-        </w:rPr>
-      </w:pPr>
-    </w:p>
-    <w:p>
-      <w:pPr>
-        <w:spacing w:after="0" w:line="360" w:lineRule="auto"/>
-        <w:rPr>
-          <w:rFonts w:ascii="Times New Roman" w:hAnsi="Times New Roman" w:cs="Times New Roman"/>
-          <w:b/>
-          <w:bCs/>
-          <w:sz w:val="24"/>
-          <w:szCs w:val="24"/>
-        </w:rPr>
-      </w:pPr>
-    </w:p>
-    <w:p>
-      <w:pPr>
-        <w:spacing w:after="0" w:line="360" w:lineRule="auto"/>
-        <w:rPr>
-          <w:rFonts w:ascii="Times New Roman" w:hAnsi="Times New Roman" w:cs="Times New Roman"/>
-          <w:b/>
-          <w:bCs/>
-          <w:sz w:val="24"/>
-          <w:szCs w:val="24"/>
-        </w:rPr>
-      </w:pPr>
     </w:p>
     <w:p>
       <w:pPr>
@@ -11920,7 +11551,6 @@
           <w:sz w:val="24"/>
           <w:szCs w:val="24"/>
         </w:rPr>
-        <w:lastRenderedPageBreak/>
         <w:t xml:space="preserve">De acordo com </w:t>
       </w:r>
       <w:proofErr w:type="spellStart"/>
@@ -13252,114 +12882,6 @@
         <w:outlineLvl w:val="1"/>
         <w:rPr>
           <w:rFonts w:ascii="Times New Roman" w:hAnsi="Times New Roman" w:cs="Times New Roman"/>
-          <w:bCs/>
-          <w:sz w:val="24"/>
-          <w:szCs w:val="24"/>
-        </w:rPr>
-      </w:pPr>
-    </w:p>
-    <w:p>
-      <w:pPr>
-        <w:spacing w:after="0" w:line="360" w:lineRule="auto"/>
-        <w:outlineLvl w:val="1"/>
-        <w:rPr>
-          <w:rFonts w:ascii="Times New Roman" w:hAnsi="Times New Roman" w:cs="Times New Roman"/>
-          <w:bCs/>
-          <w:sz w:val="24"/>
-          <w:szCs w:val="24"/>
-        </w:rPr>
-      </w:pPr>
-    </w:p>
-    <w:p>
-      <w:pPr>
-        <w:spacing w:after="0" w:line="360" w:lineRule="auto"/>
-        <w:outlineLvl w:val="1"/>
-        <w:rPr>
-          <w:rFonts w:ascii="Times New Roman" w:hAnsi="Times New Roman" w:cs="Times New Roman"/>
-          <w:bCs/>
-          <w:sz w:val="24"/>
-          <w:szCs w:val="24"/>
-        </w:rPr>
-      </w:pPr>
-    </w:p>
-    <w:p>
-      <w:pPr>
-        <w:spacing w:after="0" w:line="360" w:lineRule="auto"/>
-        <w:outlineLvl w:val="1"/>
-        <w:rPr>
-          <w:rFonts w:ascii="Times New Roman" w:hAnsi="Times New Roman" w:cs="Times New Roman"/>
-          <w:bCs/>
-          <w:sz w:val="24"/>
-          <w:szCs w:val="24"/>
-        </w:rPr>
-      </w:pPr>
-    </w:p>
-    <w:p>
-      <w:pPr>
-        <w:spacing w:after="0" w:line="360" w:lineRule="auto"/>
-        <w:outlineLvl w:val="1"/>
-        <w:rPr>
-          <w:rFonts w:ascii="Times New Roman" w:hAnsi="Times New Roman" w:cs="Times New Roman"/>
-          <w:bCs/>
-          <w:sz w:val="24"/>
-          <w:szCs w:val="24"/>
-        </w:rPr>
-      </w:pPr>
-    </w:p>
-    <w:p>
-      <w:pPr>
-        <w:spacing w:after="0" w:line="360" w:lineRule="auto"/>
-        <w:outlineLvl w:val="1"/>
-        <w:rPr>
-          <w:rFonts w:ascii="Times New Roman" w:hAnsi="Times New Roman" w:cs="Times New Roman"/>
-          <w:bCs/>
-          <w:sz w:val="24"/>
-          <w:szCs w:val="24"/>
-        </w:rPr>
-      </w:pPr>
-    </w:p>
-    <w:p>
-      <w:pPr>
-        <w:spacing w:after="0" w:line="360" w:lineRule="auto"/>
-        <w:outlineLvl w:val="1"/>
-        <w:rPr>
-          <w:rFonts w:ascii="Times New Roman" w:hAnsi="Times New Roman" w:cs="Times New Roman"/>
-          <w:bCs/>
-          <w:sz w:val="24"/>
-          <w:szCs w:val="24"/>
-        </w:rPr>
-      </w:pPr>
-    </w:p>
-    <w:p>
-      <w:pPr>
-        <w:spacing w:after="0" w:line="360" w:lineRule="auto"/>
-        <w:outlineLvl w:val="1"/>
-        <w:rPr>
-          <w:rFonts w:ascii="Times New Roman" w:hAnsi="Times New Roman" w:cs="Times New Roman"/>
-          <w:bCs/>
-          <w:sz w:val="24"/>
-          <w:szCs w:val="24"/>
-        </w:rPr>
-      </w:pPr>
-    </w:p>
-    <w:p>
-      <w:pPr>
-        <w:spacing w:after="0" w:line="360" w:lineRule="auto"/>
-        <w:outlineLvl w:val="1"/>
-        <w:rPr>
-          <w:rFonts w:ascii="Times New Roman" w:hAnsi="Times New Roman" w:cs="Times New Roman"/>
-          <w:bCs/>
-          <w:sz w:val="24"/>
-          <w:szCs w:val="24"/>
-        </w:rPr>
-      </w:pPr>
-    </w:p>
-    <w:p>
-      <w:pPr>
-        <w:spacing w:after="0" w:line="360" w:lineRule="auto"/>
-        <w:outlineLvl w:val="1"/>
-        <w:rPr>
-          <w:rFonts w:ascii="Times New Roman" w:hAnsi="Times New Roman" w:cs="Times New Roman"/>
           <w:b/>
           <w:bCs/>
           <w:sz w:val="24"/>
@@ -13376,7 +12898,6 @@
           <w:sz w:val="24"/>
           <w:szCs w:val="24"/>
         </w:rPr>
-        <w:lastRenderedPageBreak/>
         <w:t>4.</w:t>
       </w:r>
       <w:r>
@@ -13608,6 +13129,7 @@
           <w:sz w:val="24"/>
           <w:szCs w:val="24"/>
         </w:rPr>
+        <w:lastRenderedPageBreak/>
         <w:t xml:space="preserve">No presente projeto, esse SGBD foi utilizado para estruturar o banco de dados da empresa </w:t>
       </w:r>
       <w:r>
@@ -13872,27 +13394,6 @@
     <w:p>
       <w:pPr>
         <w:spacing w:after="0" w:line="360" w:lineRule="auto"/>
-        <w:rPr>
-          <w:rFonts w:ascii="Times New Roman" w:hAnsi="Times New Roman" w:cs="Times New Roman"/>
-          <w:bCs/>
-        </w:rPr>
-      </w:pPr>
-    </w:p>
-    <w:p>
-      <w:pPr>
-        <w:spacing w:after="0" w:line="360" w:lineRule="auto"/>
-        <w:rPr>
-          <w:rFonts w:ascii="Times New Roman" w:hAnsi="Times New Roman" w:cs="Times New Roman"/>
-          <w:b/>
-          <w:bCs/>
-          <w:sz w:val="24"/>
-          <w:szCs w:val="24"/>
-        </w:rPr>
-      </w:pPr>
-    </w:p>
-    <w:p>
-      <w:pPr>
-        <w:spacing w:after="0" w:line="360" w:lineRule="auto"/>
         <w:outlineLvl w:val="0"/>
         <w:rPr>
           <w:rFonts w:ascii="Times New Roman" w:hAnsi="Times New Roman" w:cs="Times New Roman"/>
@@ -13917,106 +13418,14 @@
           <w:szCs w:val="24"/>
         </w:rPr>
       </w:pPr>
-    </w:p>
-    <w:p>
-      <w:pPr>
-        <w:spacing w:after="0" w:line="360" w:lineRule="auto"/>
-        <w:outlineLvl w:val="0"/>
-        <w:rPr>
-          <w:rFonts w:ascii="Times New Roman" w:hAnsi="Times New Roman" w:cs="Times New Roman"/>
-          <w:b/>
-          <w:bCs/>
-          <w:sz w:val="24"/>
-          <w:szCs w:val="24"/>
-        </w:rPr>
-      </w:pPr>
-    </w:p>
-    <w:p>
-      <w:pPr>
-        <w:spacing w:after="0" w:line="360" w:lineRule="auto"/>
-        <w:outlineLvl w:val="0"/>
-        <w:rPr>
-          <w:rFonts w:ascii="Times New Roman" w:hAnsi="Times New Roman" w:cs="Times New Roman"/>
-          <w:b/>
-          <w:bCs/>
-          <w:sz w:val="24"/>
-          <w:szCs w:val="24"/>
-        </w:rPr>
-      </w:pPr>
-    </w:p>
-    <w:p>
-      <w:pPr>
-        <w:spacing w:after="0" w:line="360" w:lineRule="auto"/>
-        <w:outlineLvl w:val="0"/>
-        <w:rPr>
-          <w:rFonts w:ascii="Times New Roman" w:hAnsi="Times New Roman" w:cs="Times New Roman"/>
-          <w:b/>
-          <w:bCs/>
-          <w:sz w:val="24"/>
-          <w:szCs w:val="24"/>
-        </w:rPr>
-      </w:pPr>
-    </w:p>
-    <w:p>
-      <w:pPr>
-        <w:spacing w:after="0" w:line="360" w:lineRule="auto"/>
-        <w:outlineLvl w:val="0"/>
-        <w:rPr>
-          <w:rFonts w:ascii="Times New Roman" w:hAnsi="Times New Roman" w:cs="Times New Roman"/>
-          <w:b/>
-          <w:bCs/>
-          <w:sz w:val="24"/>
-          <w:szCs w:val="24"/>
-        </w:rPr>
-      </w:pPr>
-    </w:p>
-    <w:p>
-      <w:pPr>
-        <w:spacing w:after="0" w:line="360" w:lineRule="auto"/>
-        <w:outlineLvl w:val="0"/>
-        <w:rPr>
-          <w:rFonts w:ascii="Times New Roman" w:hAnsi="Times New Roman" w:cs="Times New Roman"/>
-          <w:b/>
-          <w:bCs/>
-          <w:sz w:val="24"/>
-          <w:szCs w:val="24"/>
-        </w:rPr>
-      </w:pPr>
-    </w:p>
-    <w:p>
-      <w:pPr>
-        <w:spacing w:after="0" w:line="360" w:lineRule="auto"/>
-        <w:outlineLvl w:val="0"/>
-        <w:rPr>
-          <w:rFonts w:ascii="Times New Roman" w:hAnsi="Times New Roman" w:cs="Times New Roman"/>
-          <w:b/>
-          <w:bCs/>
-          <w:sz w:val="24"/>
-          <w:szCs w:val="24"/>
-        </w:rPr>
-      </w:pPr>
-    </w:p>
-    <w:p>
-      <w:pPr>
-        <w:spacing w:after="0" w:line="360" w:lineRule="auto"/>
-        <w:outlineLvl w:val="0"/>
-        <w:rPr>
-          <w:rFonts w:ascii="Times New Roman" w:hAnsi="Times New Roman" w:cs="Times New Roman"/>
-          <w:b/>
-          <w:bCs/>
-          <w:sz w:val="24"/>
-          <w:szCs w:val="24"/>
-        </w:rPr>
-      </w:pPr>
-      <w:r>
-        <w:rPr>
-          <w:rFonts w:ascii="Times New Roman" w:hAnsi="Times New Roman" w:cs="Times New Roman"/>
-          <w:b/>
-          <w:bCs/>
-          <w:sz w:val="24"/>
-          <w:szCs w:val="24"/>
-        </w:rPr>
-        <w:lastRenderedPageBreak/>
+      <w:r>
+        <w:rPr>
+          <w:rFonts w:ascii="Times New Roman" w:hAnsi="Times New Roman" w:cs="Times New Roman"/>
+          <w:b/>
+          <w:bCs/>
+          <w:sz w:val="24"/>
+          <w:szCs w:val="24"/>
+        </w:rPr>
         <w:t>5</w:t>
       </w:r>
       <w:r>
@@ -14204,214 +13613,7 @@
     <w:p>
       <w:pPr>
         <w:spacing w:after="0" w:line="360" w:lineRule="auto"/>
-        <w:rPr>
-          <w:rFonts w:ascii="Times New Roman" w:hAnsi="Times New Roman" w:cs="Times New Roman"/>
-          <w:sz w:val="24"/>
-          <w:szCs w:val="24"/>
-        </w:rPr>
-      </w:pPr>
-    </w:p>
-    <w:p>
-      <w:pPr>
-        <w:spacing w:after="0" w:line="360" w:lineRule="auto"/>
         <w:ind w:firstLine="709"/>
-        <w:rPr>
-          <w:rFonts w:ascii="Times New Roman" w:hAnsi="Times New Roman" w:cs="Times New Roman"/>
-          <w:sz w:val="24"/>
-          <w:szCs w:val="24"/>
-        </w:rPr>
-      </w:pPr>
-    </w:p>
-    <w:p>
-      <w:pPr>
-        <w:spacing w:after="0" w:line="360" w:lineRule="auto"/>
-        <w:jc w:val="center"/>
-        <w:rPr>
-          <w:rFonts w:ascii="Times New Roman" w:hAnsi="Times New Roman" w:cs="Times New Roman"/>
-          <w:sz w:val="24"/>
-          <w:szCs w:val="24"/>
-        </w:rPr>
-      </w:pPr>
-    </w:p>
-    <w:p>
-      <w:pPr>
-        <w:spacing w:after="0" w:line="360" w:lineRule="auto"/>
-        <w:jc w:val="center"/>
-        <w:rPr>
-          <w:rFonts w:ascii="Times New Roman" w:hAnsi="Times New Roman" w:cs="Times New Roman"/>
-          <w:sz w:val="24"/>
-          <w:szCs w:val="24"/>
-        </w:rPr>
-      </w:pPr>
-    </w:p>
-    <w:p>
-      <w:pPr>
-        <w:spacing w:after="0" w:line="360" w:lineRule="auto"/>
-        <w:jc w:val="center"/>
-        <w:rPr>
-          <w:rFonts w:ascii="Times New Roman" w:hAnsi="Times New Roman" w:cs="Times New Roman"/>
-          <w:sz w:val="24"/>
-          <w:szCs w:val="24"/>
-        </w:rPr>
-      </w:pPr>
-    </w:p>
-    <w:p>
-      <w:pPr>
-        <w:spacing w:after="0" w:line="360" w:lineRule="auto"/>
-        <w:jc w:val="center"/>
-        <w:rPr>
-          <w:rFonts w:ascii="Times New Roman" w:hAnsi="Times New Roman" w:cs="Times New Roman"/>
-          <w:sz w:val="24"/>
-          <w:szCs w:val="24"/>
-        </w:rPr>
-      </w:pPr>
-    </w:p>
-    <w:p>
-      <w:pPr>
-        <w:spacing w:after="0" w:line="360" w:lineRule="auto"/>
-        <w:jc w:val="center"/>
-        <w:rPr>
-          <w:rFonts w:ascii="Times New Roman" w:hAnsi="Times New Roman" w:cs="Times New Roman"/>
-          <w:sz w:val="24"/>
-          <w:szCs w:val="24"/>
-        </w:rPr>
-      </w:pPr>
-    </w:p>
-    <w:p>
-      <w:pPr>
-        <w:spacing w:after="0" w:line="360" w:lineRule="auto"/>
-        <w:jc w:val="center"/>
-        <w:rPr>
-          <w:rFonts w:ascii="Times New Roman" w:hAnsi="Times New Roman" w:cs="Times New Roman"/>
-          <w:sz w:val="24"/>
-          <w:szCs w:val="24"/>
-        </w:rPr>
-      </w:pPr>
-    </w:p>
-    <w:p>
-      <w:pPr>
-        <w:spacing w:after="0" w:line="360" w:lineRule="auto"/>
-        <w:jc w:val="center"/>
-        <w:rPr>
-          <w:rFonts w:ascii="Times New Roman" w:hAnsi="Times New Roman" w:cs="Times New Roman"/>
-          <w:sz w:val="24"/>
-          <w:szCs w:val="24"/>
-        </w:rPr>
-      </w:pPr>
-    </w:p>
-    <w:p>
-      <w:pPr>
-        <w:spacing w:after="0" w:line="360" w:lineRule="auto"/>
-        <w:jc w:val="center"/>
-        <w:rPr>
-          <w:rFonts w:ascii="Times New Roman" w:hAnsi="Times New Roman" w:cs="Times New Roman"/>
-          <w:sz w:val="24"/>
-          <w:szCs w:val="24"/>
-        </w:rPr>
-      </w:pPr>
-    </w:p>
-    <w:p>
-      <w:pPr>
-        <w:spacing w:after="0" w:line="360" w:lineRule="auto"/>
-        <w:jc w:val="center"/>
-        <w:rPr>
-          <w:rFonts w:ascii="Times New Roman" w:hAnsi="Times New Roman" w:cs="Times New Roman"/>
-          <w:sz w:val="24"/>
-          <w:szCs w:val="24"/>
-        </w:rPr>
-      </w:pPr>
-    </w:p>
-    <w:p>
-      <w:pPr>
-        <w:spacing w:after="0" w:line="360" w:lineRule="auto"/>
-        <w:jc w:val="center"/>
-        <w:rPr>
-          <w:rFonts w:ascii="Times New Roman" w:hAnsi="Times New Roman" w:cs="Times New Roman"/>
-          <w:sz w:val="24"/>
-          <w:szCs w:val="24"/>
-        </w:rPr>
-      </w:pPr>
-    </w:p>
-    <w:p>
-      <w:pPr>
-        <w:spacing w:after="0" w:line="360" w:lineRule="auto"/>
-        <w:jc w:val="center"/>
-        <w:rPr>
-          <w:rFonts w:ascii="Times New Roman" w:hAnsi="Times New Roman" w:cs="Times New Roman"/>
-          <w:sz w:val="24"/>
-          <w:szCs w:val="24"/>
-        </w:rPr>
-      </w:pPr>
-    </w:p>
-    <w:p>
-      <w:pPr>
-        <w:spacing w:after="0" w:line="360" w:lineRule="auto"/>
-        <w:jc w:val="center"/>
-        <w:rPr>
-          <w:rFonts w:ascii="Times New Roman" w:hAnsi="Times New Roman" w:cs="Times New Roman"/>
-          <w:sz w:val="24"/>
-          <w:szCs w:val="24"/>
-        </w:rPr>
-      </w:pPr>
-    </w:p>
-    <w:p>
-      <w:pPr>
-        <w:spacing w:after="0" w:line="360" w:lineRule="auto"/>
-        <w:jc w:val="center"/>
-        <w:rPr>
-          <w:rFonts w:ascii="Times New Roman" w:hAnsi="Times New Roman" w:cs="Times New Roman"/>
-          <w:sz w:val="24"/>
-          <w:szCs w:val="24"/>
-        </w:rPr>
-      </w:pPr>
-    </w:p>
-    <w:p>
-      <w:pPr>
-        <w:spacing w:after="0" w:line="360" w:lineRule="auto"/>
-        <w:jc w:val="center"/>
-        <w:rPr>
-          <w:rFonts w:ascii="Times New Roman" w:hAnsi="Times New Roman" w:cs="Times New Roman"/>
-          <w:sz w:val="24"/>
-          <w:szCs w:val="24"/>
-        </w:rPr>
-      </w:pPr>
-    </w:p>
-    <w:p>
-      <w:pPr>
-        <w:spacing w:after="0" w:line="360" w:lineRule="auto"/>
-        <w:jc w:val="center"/>
-        <w:rPr>
-          <w:rFonts w:ascii="Times New Roman" w:hAnsi="Times New Roman" w:cs="Times New Roman"/>
-          <w:sz w:val="24"/>
-          <w:szCs w:val="24"/>
-        </w:rPr>
-      </w:pPr>
-    </w:p>
-    <w:p>
-      <w:pPr>
-        <w:spacing w:after="0" w:line="360" w:lineRule="auto"/>
-        <w:jc w:val="center"/>
-        <w:rPr>
-          <w:rFonts w:ascii="Times New Roman" w:hAnsi="Times New Roman" w:cs="Times New Roman"/>
-          <w:sz w:val="24"/>
-          <w:szCs w:val="24"/>
-        </w:rPr>
-      </w:pPr>
-    </w:p>
-    <w:p>
-      <w:pPr>
-        <w:spacing w:after="0" w:line="360" w:lineRule="auto"/>
-        <w:jc w:val="center"/>
-        <w:rPr>
-          <w:rFonts w:ascii="Times New Roman" w:hAnsi="Times New Roman" w:cs="Times New Roman"/>
-          <w:sz w:val="24"/>
-          <w:szCs w:val="24"/>
-        </w:rPr>
-      </w:pPr>
-    </w:p>
-    <w:p>
-      <w:pPr>
-        <w:spacing w:after="0" w:line="360" w:lineRule="auto"/>
         <w:rPr>
           <w:rFonts w:ascii="Times New Roman" w:hAnsi="Times New Roman" w:cs="Times New Roman"/>
           <w:sz w:val="24"/>
@@ -14459,7 +13661,6 @@
           <w:sz w:val="24"/>
           <w:szCs w:val="24"/>
         </w:rPr>
-        <w:lastRenderedPageBreak/>
         <w:t>8</w:t>
       </w:r>
       <w:r>
@@ -14652,6 +13853,7 @@
           <w:sz w:val="24"/>
           <w:szCs w:val="24"/>
         </w:rPr>
+        <w:lastRenderedPageBreak/>
         <w:t xml:space="preserve">GITHUB. </w:t>
       </w:r>
       <w:proofErr w:type="spellStart"/>
@@ -17341,7 +16543,7 @@
 </file>
 
 <file path=customXml/itemProps4.xml><?xml version="1.0" encoding="utf-8"?>
-<ds:datastoreItem xmlns:ds="http://schemas.openxmlformats.org/officeDocument/2006/customXml" ds:itemID="{F1F7BE13-C80F-4115-866A-B633C6E0107A}">
+<ds:datastoreItem xmlns:ds="http://schemas.openxmlformats.org/officeDocument/2006/customXml" ds:itemID="{F33F3715-2937-454B-816C-016F42B14B4B}">
   <ds:schemaRefs>
     <ds:schemaRef ds:uri="http://schemas.openxmlformats.org/officeDocument/2006/bibliography"/>
   </ds:schemaRefs>

</xml_diff>